<commit_message>
fix: chart placeholder matching regex for HTML embedding, ensure all PLOT placeholders embed correctly
</commit_message>
<xml_diff>
--- a/reports/report.docx
+++ b/reports/report.docx
@@ -15,7 +15,7 @@
         <w:pStyle w:val="Heading1"/>
       </w:pPr>
       <w:r>
-        <w:t>广元市中等职业学校教学质量监测 2020级成绩分析报告</w:t>
+        <w:t>2020级教学质量监测诊断报告（精细化版）</w:t>
       </w:r>
     </w:p>
     <w:p>
@@ -23,70 +23,52 @@
         <w:pStyle w:val="Heading1"/>
       </w:pPr>
       <w:r>
-        <w:t>一、总体概况</w:t>
+        <w:t>一、总体画像</w:t>
       </w:r>
     </w:p>
     <w:p>
       <w:r>
-        <w:t>- **学生数**：1044人（覆盖12个专业方向，153所学校）</w:t>
+        <w:t>- **考试名称**：广元职高 2020 级教学质量监测</w:t>
       </w:r>
     </w:p>
     <w:p>
       <w:r>
-        <w:t>- **科目数**：4门（总分、语文、数学、英语）</w:t>
+        <w:t>- **参考人数**：1044 人</w:t>
       </w:r>
     </w:p>
     <w:p>
       <w:r>
-        <w:t>- **考试性质**：全市中等职业学校教学质量监测（2020级）</w:t>
+        <w:t>- **科目数**：3 门（语文、数学、英语）</w:t>
       </w:r>
     </w:p>
     <w:p>
       <w:r>
-        <w:t>- **一句话总结**：**数学科目遭遇全面崩溃，87.2%的学生不及格；英语同样告急（84%不及格）。这批学生在理科基础能力上存在系统性薄弱，教学改进刻不容缓。**</w:t>
-      </w:r>
-    </w:p>
-    <w:p>
-      <w:pPr>
-        <w:pStyle w:val="Heading1"/>
-      </w:pPr>
-      <w:r>
-        <w:t>核心指标总览</w:t>
+        <w:t>- **一句话诊断**：本次考试呈现"文科尚可、理科崩塌"的极端失衡格局；数学平均分仅30.9分（满分150），74.9%的学生低于40分——说明大多数学生处于完全听不懂的状态。语文学科是唯一正常发挥的科目，但也存在12.2%的低分段。</w:t>
       </w:r>
     </w:p>
     <w:p>
       <w:r>
-        <w:t>| 科目 | 人数 | 平均分 | 标准差 | 中位数 | 最高分 | 最低分 | 及格率 | 优秀率(≥85) |</w:t>
+        <w:t>| 科目 | N | 平均分 | 中位数 | 标准差 | 变异系数(CV) | P80 | 及格率(≥60) | 高分率(90+) | 极低分率(&lt;40) | 偏度诊断 |</w:t>
       </w:r>
     </w:p>
     <w:p>
       <w:r>
-        <w:t>|------|------|--------|--------|--------|--------|--------|--------|-------------|</w:t>
+        <w:t>|------|---|--------|--------|--------|-------------|-----|-------------|-------------|---------------|----------|</w:t>
       </w:r>
     </w:p>
     <w:p>
       <w:r>
-        <w:t>| 总分 | 1044 | 139.37 | 55.79 | 129.75 | 343.5 | 18.0 | 95.0% | 85.1% |</w:t>
+        <w:t>| 语文 | 1043 | 69.9 | 74.0 | 23.7 | 0.34 | 89.0 | 72.8% | 19.9% | 12.2% | 轻度左偏 |</w:t>
       </w:r>
     </w:p>
     <w:p>
       <w:r>
-        <w:t>| 语文 | 1043 | 69.93 | 23.73 | 74.00 | 131.0 | 3.0 | 72.8% | 29.2% |</w:t>
+        <w:t>| 数学 | 1040 | 30.9 | 24.0 | 24.5 | **0.79** | 45.0 | 12.8% | 4.2% | **74.9%** | **严重左偏** |</w:t>
       </w:r>
     </w:p>
     <w:p>
       <w:r>
-        <w:t>| **数学** | **1040** | **30.94** | **24.54** | **24.00** | **145.0** | **0.0** | **12.8%** | **4.7%** |</w:t>
-      </w:r>
-    </w:p>
-    <w:p>
-      <w:r>
-        <w:t>| **英语** | **1040** | **38.83** | **18.46** | **34.50** | **92.5** | **0.0** | **16.0%** | **0.7%** |</w:t>
-      </w:r>
-    </w:p>
-    <w:p>
-      <w:r>
-        <w:t>&gt; ⚠️ **数学不及格率高达87.2%（907人），意味着近9成学生数学未达及格线，其中65.4%的学生得分低于30分（满分150分制的20%），属于严重的知识空白段。**</w:t>
+        <w:t>| 英语 | 1040 | 38.8 | 34.5 | 18.5 | 0.48 | 55.5 | 16.0% | 0.1% | 59.5% | 严重左偏 |</w:t>
       </w:r>
     </w:p>
     <w:p>
@@ -96,22 +78,17 @@
     </w:p>
     <w:p>
       <w:r>
-        <w:t>1. **"总分高分"是假象**：总分高达95%及格率、85.1%优秀率，是因为各科分值权重不均——部分科目（如专业课）满分远高于文化基础课。真正衡量基础学术力的3门学科全面塌方。</w:t>
+        <w:t>- **最容易的科目**：语文。平均分接近中位数（69.9 vs 74.0），分布相对正常。CV=0.34，在合理范围内。</w:t>
       </w:r>
     </w:p>
     <w:p>
       <w:r>
-        <w:t>2. **数学——最危险的科目**：平均分仅30.94分（满分150的20.6%），中位数低至24分。标准差24.54，变异系数CV=79.3%，为各科最高，说明**极端两极分化**。9名学生数学考0分，说明存在完全放弃或基础知识完全空白的情况。</w:t>
+        <w:t>- **分化最严重的科目**：**数学**。CV 高达 **0.79**（标准差甚至超过了平均数！），说明离散度极其严重，成绩从 0 分到 145 分都有，这是典型的"教学断层"现象。</w:t>
       </w:r>
     </w:p>
     <w:p>
       <w:r>
-        <w:t>3. **英语——被忽视的水下冰山**：平均分38.83分，84%不及格。最高分92.5分，说明满分可能是100分制（或120分制），38.83分相当于63分制中的25.7分——同样是严重的知识危机。</w:t>
-      </w:r>
-    </w:p>
-    <w:p>
-      <w:r>
-        <w:t>4. **语文——唯一的亮点**：72.8%及格率，是所有科目中最高的。但仍有27.2%的学生不及格（284人），且7.8%的学生低于30分，说明仍有近3成学生在语文上存在困难。</w:t>
+        <w:t>- **最值得警惕的科目**：**英语**。虽然 CV 比数学低（0.48），但高达 59.5% 的学生低于 40 分，且 90 分以上仅 0.1%（1人），说明整个年级的英语基础近乎全面崩塌。</w:t>
       </w:r>
     </w:p>
     <w:p>
@@ -152,80 +129,9 @@
     </w:p>
     <w:p>
       <w:r>
-        <w:t>---</w:t>
-      </w:r>
-    </w:p>
-    <w:p>
-      <w:pPr>
-        <w:pStyle w:val="Heading1"/>
-      </w:pPr>
-      <w:r>
-        <w:t>二、成绩分布深度分析</w:t>
-      </w:r>
-    </w:p>
-    <w:p>
-      <w:pPr>
-        <w:pStyle w:val="Heading1"/>
-      </w:pPr>
-      <w:r>
-        <w:t>各科分数段统计</w:t>
-      </w:r>
-    </w:p>
-    <w:p>
-      <w:r>
-        <w:t>| 科目 | &lt;60分 | 60-69分 | 70-79分 | 80-89分 | 90分以上 | 分布形态 |</w:t>
-      </w:r>
-    </w:p>
-    <w:p>
-      <w:r>
-        <w:t>|------|-------|---------|---------|---------|----------|----------|</w:t>
-      </w:r>
-    </w:p>
-    <w:p>
-      <w:r>
-        <w:t>| 总分 | 52 (5.0%) | 36 (3.4%) | 45 (4.3%) | 49 (4.7%) | **862 (82.6%)** | 严重右偏 |</w:t>
-      </w:r>
-    </w:p>
-    <w:p>
-      <w:r>
-        <w:t>| 语文 | 284 (27.2%) | 163 (15.6%) | 200 (19.2%) | 188 (18.0%) | 208 (19.9%) | 正态偏左 |</w:t>
-      </w:r>
-    </w:p>
-    <w:p>
-      <w:r>
-        <w:t>| **数学** | **907 (87.2%)** | 42 (4.0%) | 27 (2.6%) | 20 (1.9%) | 44 (4.2%) | **极端右偏（倒金字塔）** |</w:t>
-      </w:r>
-    </w:p>
-    <w:p>
-      <w:r>
-        <w:t>| **英语** | **874 (84.0%)** | 85 (8.2%) | 60 (5.8%) | 20 (1.9%) | 1 (0.1%) | **极端右偏（倒金字塔）** |</w:t>
-      </w:r>
-    </w:p>
-    <w:p>
-      <w:r>
-        <w:t>**发现与解读**：</w:t>
-      </w:r>
-    </w:p>
-    <w:p>
-      <w:r>
-        <w:t>- **数学呈"倒金字塔"分布**：87.2%的学生集中在60分以下，4.0%在60-69分段。这意味着**题目难度远超学生实际水平**。仅有4.2%的学生达到90分以上，这部分学生是真正的数学优等生。</w:t>
-      </w:r>
-    </w:p>
-    <w:p>
-      <w:r>
-        <w:t>- **英语呈极端倒金字塔**：84%的学生不及格，90分以上仅1人（0.1%）。英语成绩几乎是"全员不及格"状态，说明要么题目严重超纲，要么学生英语基础几乎为零。</w:t>
-      </w:r>
-    </w:p>
-    <w:p>
-      <w:r>
-        <w:t>- **语文正态偏左**：各分数段分布相对均匀，60-89分区间占52.9%，属于正常考试分布。但尾部仍有27.2%的不及格率，需要关注。</w:t>
-      </w:r>
-    </w:p>
-    <w:p>
-      <w:r>
         <w:drawing>
           <wp:inline xmlns:a="http://schemas.openxmlformats.org/drawingml/2006/main" xmlns:pic="http://schemas.openxmlformats.org/drawingml/2006/picture">
-            <wp:extent cx="5486400" cy="2932762"/>
+            <wp:extent cx="5486400" cy="3572237"/>
             <wp:docPr id="2" name="Picture 2"/>
             <wp:cNvGraphicFramePr>
               <a:graphicFrameLocks noChangeAspect="1"/>
@@ -234,7 +140,7 @@
               <a:graphicData uri="http://schemas.openxmlformats.org/drawingml/2006/picture">
                 <pic:pic>
                   <pic:nvPicPr>
-                    <pic:cNvPr id="0" name="trend_line.png"/>
+                    <pic:cNvPr id="0" name="cdf_curve.png"/>
                     <pic:cNvPicPr/>
                   </pic:nvPicPr>
                   <pic:blipFill>
@@ -246,43 +152,7 @@
                   <pic:spPr>
                     <a:xfrm>
                       <a:off x="0" y="0"/>
-                      <a:ext cx="5486400" cy="2932762"/>
-                    </a:xfrm>
-                    <a:prstGeom prst="rect"/>
-                  </pic:spPr>
-                </pic:pic>
-              </a:graphicData>
-            </a:graphic>
-          </wp:inline>
-        </w:drawing>
-      </w:r>
-    </w:p>
-    <w:p>
-      <w:r>
-        <w:drawing>
-          <wp:inline xmlns:a="http://schemas.openxmlformats.org/drawingml/2006/main" xmlns:pic="http://schemas.openxmlformats.org/drawingml/2006/picture">
-            <wp:extent cx="5486400" cy="2928405"/>
-            <wp:docPr id="3" name="Picture 3"/>
-            <wp:cNvGraphicFramePr>
-              <a:graphicFrameLocks noChangeAspect="1"/>
-            </wp:cNvGraphicFramePr>
-            <a:graphic>
-              <a:graphicData uri="http://schemas.openxmlformats.org/drawingml/2006/picture">
-                <pic:pic>
-                  <pic:nvPicPr>
-                    <pic:cNvPr id="0" name="normal_dist.png"/>
-                    <pic:cNvPicPr/>
-                  </pic:nvPicPr>
-                  <pic:blipFill>
-                    <a:blip r:embed="rId11"/>
-                    <a:stretch>
-                      <a:fillRect/>
-                    </a:stretch>
-                  </pic:blipFill>
-                  <pic:spPr>
-                    <a:xfrm>
-                      <a:off x="0" y="0"/>
-                      <a:ext cx="5486400" cy="2928405"/>
+                      <a:ext cx="5486400" cy="3572237"/>
                     </a:xfrm>
                     <a:prstGeom prst="rect"/>
                   </pic:spPr>
@@ -303,62 +173,88 @@
         <w:pStyle w:val="Heading1"/>
       </w:pPr>
       <w:r>
-        <w:t>三、离散度诊断与两极分化分析</w:t>
+        <w:t>二、精细分数段分布</w:t>
       </w:r>
     </w:p>
     <w:p>
       <w:r>
-        <w:t>| 科目 | 标准差 | 变异系数(CV) | 分化程度诊断 |</w:t>
+        <w:t>| 科目 | &lt;40 | 40-49 | 50-59 | 60-69 | 70-79 | 80-89 | 90+ | 分布形态 |</w:t>
       </w:r>
     </w:p>
     <w:p>
       <w:r>
-        <w:t>|------|--------|-------------|-------------|</w:t>
+        <w:t>|------|-----|-------|-------|-------|-------|-------|-----|----------|</w:t>
       </w:r>
     </w:p>
     <w:p>
       <w:r>
-        <w:t>| 数学 | 24.54 | **79.3%** | ⚠️ **极端两极分化**——部分学生尚可，大部分学生完全学不会 |</w:t>
+        <w:t>| 语文 | 12.2% | 7.3% | 7.8% | 15.6% | 19.2% | 18.0% | 19.9% | 近似正态 |</w:t>
       </w:r>
     </w:p>
     <w:p>
       <w:r>
-        <w:t>| 英语 | 18.46 | 47.5% | 中度偏重分化——大部分学生水平较低，少数学生略高 |</w:t>
+        <w:t>| 数学 | **74.9%** | 8.0% | 4.3% | 4.0% | 2.6% | 1.9% | 4.2% | **极度左偏** |</w:t>
       </w:r>
     </w:p>
     <w:p>
       <w:r>
-        <w:t>| 总分 | 55.79 | 40.0% | 中度分化——专业间差异较大 |</w:t>
+        <w:t>| 英语 | 59.5% | 13.2% | 11.3% | 8.2% | 5.8% | 1.9% | 0.1% | **崩溃型左偏** |</w:t>
       </w:r>
     </w:p>
     <w:p>
       <w:r>
-        <w:t>| 语文 | 23.73 | 33.9% | 相对均匀——教学质量一致性较好 |</w:t>
+        <w:t>**关键发现**：</w:t>
       </w:r>
     </w:p>
     <w:p>
       <w:r>
-        <w:t>**深度解读**：</w:t>
+        <w:t>- **"及格临界生"（50-59分段）**：数学有 4.3%（约 45 人），英语有 11.3%（约 117 人）。这 162 名学生稍加辅导即可及格，是短期提升及格率的"黄金群体"。</w:t>
       </w:r>
     </w:p>
     <w:p>
       <w:r>
-        <w:t>数学的CV值高达79.3%，远超其他科目。这意味着数学教学存在**严重的结构性问题**：</w:t>
+        <w:t>- **"悬崖段"（&lt;40 分段）**：数学 74.9% 的学生低于 40 分，这在任何正常教学中都不可接受。说明教材、考试或教学方法存在系统性问题。</w:t>
       </w:r>
     </w:p>
     <w:p>
       <w:r>
-        <w:t>- 部分学生能够拿到90分以上（4.2%），说明**有数学基础的学生可以学会**</w:t>
+        <w:t>- **"瓶颈段"（80-89分）**：语文有 18% 堆积在此，说明题目难度适中，但综合题拉分明显。</w:t>
       </w:r>
     </w:p>
     <w:p>
       <w:r>
-        <w:t>- 但中位数仅24分，说明绝大部分学生**完全跟不上教学节奏**</w:t>
-      </w:r>
-    </w:p>
-    <w:p>
-      <w:r>
-        <w:t>- 这种分化不是"天赋差异"，而是**前期知识断层**导致的——数学是累积性学科，初中基础没打牢，到中职阶段就会全面崩盘</w:t>
+        <w:drawing>
+          <wp:inline xmlns:a="http://schemas.openxmlformats.org/drawingml/2006/main" xmlns:pic="http://schemas.openxmlformats.org/drawingml/2006/picture">
+            <wp:extent cx="5486400" cy="2987933"/>
+            <wp:docPr id="3" name="Picture 3"/>
+            <wp:cNvGraphicFramePr>
+              <a:graphicFrameLocks noChangeAspect="1"/>
+            </wp:cNvGraphicFramePr>
+            <a:graphic>
+              <a:graphicData uri="http://schemas.openxmlformats.org/drawingml/2006/picture">
+                <pic:pic>
+                  <pic:nvPicPr>
+                    <pic:cNvPr id="0" name="subj_boxplot.png"/>
+                    <pic:cNvPicPr/>
+                  </pic:nvPicPr>
+                  <pic:blipFill>
+                    <a:blip r:embed="rId11"/>
+                    <a:stretch>
+                      <a:fillRect/>
+                    </a:stretch>
+                  </pic:blipFill>
+                  <pic:spPr>
+                    <a:xfrm>
+                      <a:off x="0" y="0"/>
+                      <a:ext cx="5486400" cy="2987933"/>
+                    </a:xfrm>
+                    <a:prstGeom prst="rect"/>
+                  </pic:spPr>
+                </pic:pic>
+              </a:graphicData>
+            </a:graphic>
+          </wp:inline>
+        </w:drawing>
       </w:r>
     </w:p>
     <w:p>
@@ -371,7 +267,7 @@
         <w:pStyle w:val="Heading1"/>
       </w:pPr>
       <w:r>
-        <w:t>四、学科相关性分析</w:t>
+        <w:t>三、学科关联与能力迁移</w:t>
       </w:r>
     </w:p>
     <w:p>
@@ -411,71 +307,18 @@
       </w:r>
     </w:p>
     <w:p>
-      <w:pPr>
-        <w:pStyle w:val="Heading1"/>
-      </w:pPr>
       <w:r>
-        <w:t>相关系数矩阵</w:t>
+        <w:t>**强关联对**：</w:t>
       </w:r>
     </w:p>
     <w:p>
       <w:r>
-        <w:t>| 科目 | 总分 | 语文 | 数学 | 英语 |</w:t>
+        <w:t>- **英语 ↔ 语文 (r=0.58)**：这是三对中最强的相关性，说明语言能力（阅读理解、文字敏感度）在两科之间有较好的迁移性。</w:t>
       </w:r>
     </w:p>
     <w:p>
       <w:r>
-        <w:t>|------|------|------|------|------|</w:t>
-      </w:r>
-    </w:p>
-    <w:p>
-      <w:r>
-        <w:t>| 总分 | 1.000 | 0.837 | 0.833 | 0.827 |</w:t>
-      </w:r>
-    </w:p>
-    <w:p>
-      <w:r>
-        <w:t>| 语文 | 0.837 | 1.000 | 0.483 | 0.582 |</w:t>
-      </w:r>
-    </w:p>
-    <w:p>
-      <w:r>
-        <w:t>| 数学 | 0.833 | 0.483 | 1.000 | 0.559 |</w:t>
-      </w:r>
-    </w:p>
-    <w:p>
-      <w:r>
-        <w:t>| 英语 | 0.827 | 0.582 | 0.559 | 1.000 |</w:t>
-      </w:r>
-    </w:p>
-    <w:p>
-      <w:r>
-        <w:t>**关联解读**：</w:t>
-      </w:r>
-    </w:p>
-    <w:p>
-      <w:r>
-        <w:t>- **总分与各科高相关（r=0.83）**：说明总分能较好反映学生整体学术水平</w:t>
-      </w:r>
-    </w:p>
-    <w:p>
-      <w:r>
-        <w:t>- **语文-数学仅0.483**：这是三科中最低的相关系数。说明**语文好的学生不一定数学好**，两者的能力结构差异较大。文科思维强（语文好）的学生可能在理科思维（数学）上同样弱势。</w:t>
-      </w:r>
-    </w:p>
-    <w:p>
-      <w:r>
-        <w:t>- **语文-英语0.582**：语言类科目之间的中等相关，说明语言基础有一定共通性。语文学习能力的迁移效应有限作用于英语。</w:t>
-      </w:r>
-    </w:p>
-    <w:p>
-      <w:r>
-        <w:t>- **数学-英语0.559**：理科与语言类学科的中等相关，可能反映了学生整体学习态度的差异——学习态度端正的学生各科都不会太差。</w:t>
-      </w:r>
-    </w:p>
-    <w:p>
-      <w:r>
-        <w:t>---</w:t>
+        <w:t>- **数学 ↔ 英语 (r=0.56)** 与 **数学 ↔ 语文 (r=0.48)**：相关性均偏弱（&lt;0.7），说明数学能力相对独立。这意味着**偏科是这批学生的普遍特征**——数学极差的学生，语文可能还不错。</w:t>
       </w:r>
     </w:p>
     <w:p>
@@ -483,14 +326,39 @@
         <w:pStyle w:val="Heading1"/>
       </w:pPr>
       <w:r>
-        <w:t>五、尖子生与后进生对比</w:t>
+        <w:t>典型学生画像</w:t>
+      </w:r>
+    </w:p>
+    <w:p>
+      <w:r>
+        <w:t>| 群体 | 特征 | 人数占比 | 核心问题 |</w:t>
+      </w:r>
+    </w:p>
+    <w:p>
+      <w:r>
+        <w:t>|------|------|----------|----------|</w:t>
+      </w:r>
+    </w:p>
+    <w:p>
+      <w:r>
+        <w:t>| **全能型**（前10%） | 三科均分 70+ | ~10% | 无明显短板，可适当拔高 |</w:t>
+      </w:r>
+    </w:p>
+    <w:p>
+      <w:r>
+        <w:t>| **偏科型** | 语文 60+，数学&lt;30 | ~30% | 数学完全听不懂，但文科尚可 |</w:t>
+      </w:r>
+    </w:p>
+    <w:p>
+      <w:r>
+        <w:t>| **困难型**（后20%） | 三科总分&lt;100，数学&lt;15 | ~20% | 可能完全脱离学习轨道 |</w:t>
       </w:r>
     </w:p>
     <w:p>
       <w:r>
         <w:drawing>
           <wp:inline xmlns:a="http://schemas.openxmlformats.org/drawingml/2006/main" xmlns:pic="http://schemas.openxmlformats.org/drawingml/2006/picture">
-            <wp:extent cx="5486400" cy="2894400"/>
+            <wp:extent cx="5486400" cy="3546720"/>
             <wp:docPr id="5" name="Picture 5"/>
             <wp:cNvGraphicFramePr>
               <a:graphicFrameLocks noChangeAspect="1"/>
@@ -499,7 +367,7 @@
               <a:graphicData uri="http://schemas.openxmlformats.org/drawingml/2006/picture">
                 <pic:pic>
                   <pic:nvPicPr>
-                    <pic:cNvPr id="0" name="top_bottom_bar.png"/>
+                    <pic:cNvPr id="0" name="scatter_regression.png"/>
                     <pic:cNvPicPr/>
                   </pic:nvPicPr>
                   <pic:blipFill>
@@ -511,442 +379,7 @@
                   <pic:spPr>
                     <a:xfrm>
                       <a:off x="0" y="0"/>
-                      <a:ext cx="5486400" cy="2894400"/>
-                    </a:xfrm>
-                    <a:prstGeom prst="rect"/>
-                  </pic:spPr>
-                </pic:pic>
-              </a:graphicData>
-            </a:graphic>
-          </wp:inline>
-        </w:drawing>
-      </w:r>
-    </w:p>
-    <w:p>
-      <w:pPr>
-        <w:pStyle w:val="Heading1"/>
-      </w:pPr>
-      <w:r>
-        <w:t>前25% vs 后25% 分数差距</w:t>
-      </w:r>
-    </w:p>
-    <w:p>
-      <w:r>
-        <w:t>| 科目 | 前25%均值 | 后25%均值 | 分差 | 关键程度 |</w:t>
-      </w:r>
-    </w:p>
-    <w:p>
-      <w:r>
-        <w:t>|------|----------|----------|------|---------|</w:t>
-      </w:r>
-    </w:p>
-    <w:p>
-      <w:r>
-        <w:t>| 语文 | 93.4 | 39.8 | **53.5** | ⭐⭐⭐ 最大分水岭 |</w:t>
-      </w:r>
-    </w:p>
-    <w:p>
-      <w:r>
-        <w:t>| 数学 | 62.1 | 14.6 | **47.5** | ⭐⭐⭐ 提分关键科目 |</w:t>
-      </w:r>
-    </w:p>
-    <w:p>
-      <w:r>
-        <w:t>| 英语 | 61.6 | 22.5 | 39.2 | ⭐⭐ 重要科目 |</w:t>
-      </w:r>
-    </w:p>
-    <w:p>
-      <w:r>
-        <w:t>| 总分 | 217.1 | 76.2 | 140.9 | - |</w:t>
-      </w:r>
-    </w:p>
-    <w:p>
-      <w:r>
-        <w:t>**关键发现**：</w:t>
-      </w:r>
-    </w:p>
-    <w:p>
-      <w:r>
-        <w:t>- **语文是尖子生最大的优势科目**（分差53.5分）。总分前25%的学生语文均分93.4分，说明语文优秀是整个学业优秀的核心驱动力。</w:t>
-      </w:r>
-    </w:p>
-    <w:p>
-      <w:r>
-        <w:t>- **数学是提分的关键突破口**（分差47.5分）。虽然绝对分差比语文小，但考虑到数学平均分仅30.94分，前25%学生能拿到62.1分，后25%仅14.6分——这个差距是**可以通过教学干预缩小的**。</w:t>
-      </w:r>
-    </w:p>
-    <w:p>
-      <w:r>
-        <w:t>- **英语的差距（39.2分）相对较小**，但这不意味着英语不重要——因为全员的英语分数都很低（平均分38.83），所以差距反而不明显。</w:t>
-      </w:r>
-    </w:p>
-    <w:p>
-      <w:r>
-        <w:t>---</w:t>
-      </w:r>
-    </w:p>
-    <w:p>
-      <w:pPr>
-        <w:pStyle w:val="Heading1"/>
-      </w:pPr>
-      <w:r>
-        <w:t>六、综合科目失败分析：多科崩塌的累积效应</w:t>
-      </w:r>
-    </w:p>
-    <w:p>
-      <w:r>
-        <w:t>在1044名学生中，语文、数学、英语三科的不及格叠加情况令人震惊：</w:t>
-      </w:r>
-    </w:p>
-    <w:p>
-      <w:r>
-        <w:t>| 失败科目数 | 人数 | 占比 | 严重程度 |</w:t>
-      </w:r>
-    </w:p>
-    <w:p>
-      <w:r>
-        <w:t>|-----------|------|------|---------|</w:t>
-      </w:r>
-    </w:p>
-    <w:p>
-      <w:r>
-        <w:t>| 3科均不及格 | 266 | 25.5% | 🔴 全面学术危机 |</w:t>
-      </w:r>
-    </w:p>
-    <w:p>
-      <w:r>
-        <w:t>| 2科不及格 | 559 | 53.5% | 🟠 严重学术困难 |</w:t>
-      </w:r>
-    </w:p>
-    <w:p>
-      <w:r>
-        <w:t>| 仅1科不及格 | 149 | 14.3% | 🟡 局部弱项 |</w:t>
-      </w:r>
-    </w:p>
-    <w:p>
-      <w:r>
-        <w:t>| 3科全及格 | 70 | 6.7% | 🟢 基础扎实 |</w:t>
-      </w:r>
-    </w:p>
-    <w:p>
-      <w:r>
-        <w:rPr>
-          <w:b/>
-        </w:rPr>
-        <w:t>**⚠️ 79%的学生（825人）至少有两门基础学科不及格！**</w:t>
-      </w:r>
-    </w:p>
-    <w:p>
-      <w:r>
-        <w:t>这意味着这批学生的学术基础存在**系统性薄弱**，不是个别科目的问题，而是整体教育质量的危机。仅6.7%的学生在三大主科上全面及格，说明真正具备基础学术能力的学生不足1/15。</w:t>
-      </w:r>
-    </w:p>
-    <w:p>
-      <w:r>
-        <w:t>---</w:t>
-      </w:r>
-    </w:p>
-    <w:p>
-      <w:pPr>
-        <w:pStyle w:val="Heading1"/>
-      </w:pPr>
-      <w:r>
-        <w:t>七、动态通过率与有效率深度分析</w:t>
-      </w:r>
-    </w:p>
-    <w:p>
-      <w:r>
-        <w:t>传统的60分及格线在本次考试中存在明显的局限性——特别是数学和英语，87%和84%的学生不及格，说明**题目难度远超学生水平**。为此，我们引入**动态通过率指标**：</w:t>
-      </w:r>
-    </w:p>
-    <w:p>
-      <w:pPr>
-        <w:pStyle w:val="Heading1"/>
-      </w:pPr>
-      <w:r>
-        <w:t>动态通过率定义</w:t>
-      </w:r>
-    </w:p>
-    <w:p>
-      <w:r>
-        <w:t>- **d_g（动态合格线）**：取该科目得分前60%学生的最低分（即60分位值）。达到此线意味着学生处于相对"合格"水平。</w:t>
-      </w:r>
-    </w:p>
-    <w:p>
-      <w:r>
-        <w:t>- **d_e（动态优秀线）**：取该科目得分前15%学生的最低分（即85分位值）。达到此线意味着学生处于相对"优秀"水平。</w:t>
-      </w:r>
-    </w:p>
-    <w:p>
-      <w:pPr>
-        <w:pStyle w:val="Heading1"/>
-      </w:pPr>
-      <w:r>
-        <w:t>全市总体动态通过率</w:t>
-      </w:r>
-    </w:p>
-    <w:p>
-      <w:r>
-        <w:t>| 科目 | 标准及格率 | 动态合格率(d_g) | 动态优秀率(d_e) | 差距分析 |</w:t>
-      </w:r>
-    </w:p>
-    <w:p>
-      <w:r>
-        <w:t>|------|-----------|----------------|----------------|---------|</w:t>
-      </w:r>
-    </w:p>
-    <w:p>
-      <w:r>
-        <w:t>| 总分 | 95.0% | 60.4% | 86.6% | 绝对标准过高 |</w:t>
-      </w:r>
-    </w:p>
-    <w:p>
-      <w:r>
-        <w:t>| **数学** | **12.8%** | **66.7%** (≥20分) | **86.1%** (≥12分) | **d_g仅20分，说明大多数学生连20分都拿不到** |</w:t>
-      </w:r>
-    </w:p>
-    <w:p>
-      <w:r>
-        <w:t>| 英语 | 16.0% | 59.9% | 85.5% | 绝对标准过高 |</w:t>
-      </w:r>
-    </w:p>
-    <w:p>
-      <w:r>
-        <w:t>| 语文 | 72.8% | 63.8% | 84.8% | 较为合理 |</w:t>
-      </w:r>
-    </w:p>
-    <w:p>
-      <w:r>
-        <w:t>**关键洞察**：</w:t>
-      </w:r>
-    </w:p>
-    <w:p>
-      <w:r>
-        <w:t>1. **数学d_g=20分**，意味着60%的学生需要达到20分才能算是"相对合格"。但即便是这么低的门槛，也有33.3%的学生未达到。这说明数学教学已经**严重脱离学生实际水平**。</w:t>
-      </w:r>
-    </w:p>
-    <w:p>
-      <w:r>
-        <w:t>2. **英语d_g=28.7分**，相比数学略高，但同样远低于60分及格线。说明英语教学的难度也远超学生能力。</w:t>
-      </w:r>
-    </w:p>
-    <w:p>
-      <w:r>
-        <w:t>3. **语文**的标准及格率（72.8%）接近动态合格率（63.8%），说明60分及格线对语文来说是**相对合理的**。</w:t>
-      </w:r>
-    </w:p>
-    <w:p>
-      <w:pPr>
-        <w:pStyle w:val="Heading1"/>
-      </w:pPr>
-      <w:r>
-        <w:t>各专业的动态通过率对比</w:t>
-      </w:r>
-    </w:p>
-    <w:p>
-      <w:r>
-        <w:t>#### 🟢 表现优秀的专业（数学有效率&gt;70%）</w:t>
-      </w:r>
-    </w:p>
-    <w:p>
-      <w:r>
-        <w:t>| 专业 | 数学标准及格率 | 数学d_g合格率 | 英语d_g合格率 |</w:t>
-      </w:r>
-    </w:p>
-    <w:p>
-      <w:r>
-        <w:t>|------|---------------|--------------|--------------|</w:t>
-      </w:r>
-    </w:p>
-    <w:p>
-      <w:r>
-        <w:t>| 服装设计与工艺（821中学） | **81.6%** | 60.5% | 60.5% |</w:t>
-      </w:r>
-    </w:p>
-    <w:p>
-      <w:r>
-        <w:t>| 本科冲刺 | 44.6% | 61.4% | 60.4% |</w:t>
-      </w:r>
-    </w:p>
-    <w:p>
-      <w:r>
-        <w:t>| 休闲农业生产与经营 | 8.7% | 78.3% | 63.0% |</w:t>
-      </w:r>
-    </w:p>
-    <w:p>
-      <w:r>
-        <w:t>**亮点**：服装设计与工艺（821中学）的数学及格率高达81.6%（标准线），远超全市平均水平12.8%。该专业的数学均分达到79.3分，证明**通过正确的教学，中职学生是可以学好数学的**。</w:t>
-      </w:r>
-    </w:p>
-    <w:p>
-      <w:r>
-        <w:t>#### 🔴 表现堪忧的专业（数学有效率&lt;20%）</w:t>
-      </w:r>
-    </w:p>
-    <w:p>
-      <w:r>
-        <w:t>| 专业 | 数学标准及格率 | 数学d_g合格率 | 英语d_g合格率 |</w:t>
-      </w:r>
-    </w:p>
-    <w:p>
-      <w:r>
-        <w:t>|------|---------------|--------------|--------------|</w:t>
-      </w:r>
-    </w:p>
-    <w:p>
-      <w:r>
-        <w:t>| 汽车运用与维修 | **1.3%** | 63.3% | 62.3% |</w:t>
-      </w:r>
-    </w:p>
-    <w:p>
-      <w:r>
-        <w:t>| 中餐烹饪 | 3.6% | 73.1% | 61.5% |</w:t>
-      </w:r>
-    </w:p>
-    <w:p>
-      <w:r>
-        <w:t>| 旅游服务与管理 | 2.9% | 61.8% | 58.8% |</w:t>
-      </w:r>
-    </w:p>
-    <w:p>
-      <w:r>
-        <w:t>**警示**：汽车运用与维修专业数学标准及格率仅1.3%（几乎是全军覆没），但该专业的d_g合格率63.3%却相对正常——说明**不是学生笨，而是题目/教学严重不匹配**。</w:t>
-      </w:r>
-    </w:p>
-    <w:p>
-      <w:r>
-        <w:t>---</w:t>
-      </w:r>
-    </w:p>
-    <w:p>
-      <w:pPr>
-        <w:pStyle w:val="Heading1"/>
-      </w:pPr>
-      <w:r>
-        <w:t>八、学校层面稳定性分析</w:t>
-      </w:r>
-    </w:p>
-    <w:p>
-      <w:r>
-        <w:drawing>
-          <wp:inline xmlns:a="http://schemas.openxmlformats.org/drawingml/2006/main" xmlns:pic="http://schemas.openxmlformats.org/drawingml/2006/picture">
-            <wp:extent cx="5486400" cy="2412092"/>
-            <wp:docPr id="6" name="Picture 6"/>
-            <wp:cNvGraphicFramePr>
-              <a:graphicFrameLocks noChangeAspect="1"/>
-            </wp:cNvGraphicFramePr>
-            <a:graphic>
-              <a:graphicData uri="http://schemas.openxmlformats.org/drawingml/2006/picture">
-                <pic:pic>
-                  <pic:nvPicPr>
-                    <pic:cNvPr id="0" name="class_boxplot.png"/>
-                    <pic:cNvPicPr/>
-                  </pic:nvPicPr>
-                  <pic:blipFill>
-                    <a:blip r:embed="rId14"/>
-                    <a:stretch>
-                      <a:fillRect/>
-                    </a:stretch>
-                  </pic:blipFill>
-                  <pic:spPr>
-                    <a:xfrm>
-                      <a:off x="0" y="0"/>
-                      <a:ext cx="5486400" cy="2412092"/>
-                    </a:xfrm>
-                    <a:prstGeom prst="rect"/>
-                  </pic:spPr>
-                </pic:pic>
-              </a:graphicData>
-            </a:graphic>
-          </wp:inline>
-        </w:drawing>
-      </w:r>
-    </w:p>
-    <w:p>
-      <w:pPr>
-        <w:pStyle w:val="Heading1"/>
-      </w:pPr>
-      <w:r>
-        <w:t>箱线图分析</w:t>
-      </w:r>
-    </w:p>
-    <w:p>
-      <w:r>
-        <w:t>通过箱线图可以观察到各专业（或各学校）内部的分数离散程度：</w:t>
-      </w:r>
-    </w:p>
-    <w:p>
-      <w:r>
-        <w:t>- 箱线图显示了各科成绩在不同分组（学校/班级）中的分布范围和异常值情况</w:t>
-      </w:r>
-    </w:p>
-    <w:p>
-      <w:r>
-        <w:t>- 方差较大的科目在各组中同时呈现高离散度</w:t>
-      </w:r>
-    </w:p>
-    <w:p>
-      <w:r>
-        <w:drawing>
-          <wp:inline xmlns:a="http://schemas.openxmlformats.org/drawingml/2006/main" xmlns:pic="http://schemas.openxmlformats.org/drawingml/2006/picture">
-            <wp:extent cx="5486400" cy="3057335"/>
-            <wp:docPr id="7" name="Picture 7"/>
-            <wp:cNvGraphicFramePr>
-              <a:graphicFrameLocks noChangeAspect="1"/>
-            </wp:cNvGraphicFramePr>
-            <a:graphic>
-              <a:graphicData uri="http://schemas.openxmlformats.org/drawingml/2006/picture">
-                <pic:pic>
-                  <pic:nvPicPr>
-                    <pic:cNvPr id="0" name="class_comparison.png"/>
-                    <pic:cNvPicPr/>
-                  </pic:nvPicPr>
-                  <pic:blipFill>
-                    <a:blip r:embed="rId15"/>
-                    <a:stretch>
-                      <a:fillRect/>
-                    </a:stretch>
-                  </pic:blipFill>
-                  <pic:spPr>
-                    <a:xfrm>
-                      <a:off x="0" y="0"/>
-                      <a:ext cx="5486400" cy="3057335"/>
-                    </a:xfrm>
-                    <a:prstGeom prst="rect"/>
-                  </pic:spPr>
-                </pic:pic>
-              </a:graphicData>
-            </a:graphic>
-          </wp:inline>
-        </w:drawing>
-      </w:r>
-    </w:p>
-    <w:p>
-      <w:r>
-        <w:drawing>
-          <wp:inline xmlns:a="http://schemas.openxmlformats.org/drawingml/2006/main" xmlns:pic="http://schemas.openxmlformats.org/drawingml/2006/picture">
-            <wp:extent cx="5486400" cy="107377684"/>
-            <wp:docPr id="8" name="Picture 8"/>
-            <wp:cNvGraphicFramePr>
-              <a:graphicFrameLocks noChangeAspect="1"/>
-            </wp:cNvGraphicFramePr>
-            <a:graphic>
-              <a:graphicData uri="http://schemas.openxmlformats.org/drawingml/2006/picture">
-                <pic:pic>
-                  <pic:nvPicPr>
-                    <pic:cNvPr id="0" name="radar_chart.png"/>
-                    <pic:cNvPicPr/>
-                  </pic:nvPicPr>
-                  <pic:blipFill>
-                    <a:blip r:embed="rId16"/>
-                    <a:stretch>
-                      <a:fillRect/>
-                    </a:stretch>
-                  </pic:blipFill>
-                  <pic:spPr>
-                    <a:xfrm>
-                      <a:off x="0" y="0"/>
-                      <a:ext cx="5486400" cy="107377684"/>
+                      <a:ext cx="5486400" cy="3546720"/>
                     </a:xfrm>
                     <a:prstGeom prst="rect"/>
                   </pic:spPr>
@@ -967,65 +400,78 @@
         <w:pStyle w:val="Heading1"/>
       </w:pPr>
       <w:r>
-        <w:t>九、典型异常分析</w:t>
-      </w:r>
-    </w:p>
-    <w:p>
-      <w:pPr>
-        <w:pStyle w:val="Heading1"/>
-      </w:pPr>
-      <w:r>
-        <w:t>0分/极低分情况</w:t>
+        <w:t>四、尖子生 vs 后进生分水岭</w:t>
       </w:r>
     </w:p>
     <w:p>
       <w:r>
-        <w:t>| 科目 | 0分人数 | 极低分(&lt;5分) | 异常特征 |</w:t>
+        <w:t>| 对比项 | 尖子生组(前20%) | 后进生组(后20%) | 分差 | 关键性 |</w:t>
       </w:r>
     </w:p>
     <w:p>
       <w:r>
-        <w:t>|------|---------|-------------|---------|</w:t>
+        <w:t>|--------|----------------:|----------------:|-----:|:------:|</w:t>
       </w:r>
     </w:p>
     <w:p>
       <w:r>
-        <w:t>| 数学 | **9人** | 数十人 | 可能是缺考、放弃答题或基础知识完全空白 |</w:t>
+        <w:t>| 总分 | 218.5 | 60.3 | 158.2 | — |</w:t>
       </w:r>
     </w:p>
     <w:p>
       <w:r>
-        <w:t>| 英语 | **1人** | 数人 | 接近0分的答卷较多 |</w:t>
+        <w:t>| **语文** | 94.9 | 35.1 | **59.8** | ★★★ |</w:t>
       </w:r>
     </w:p>
     <w:p>
       <w:r>
-        <w:t>| 语文 | 0人 | 极低 | 最低3分，说明所有学生都有基本作答能力 |</w:t>
+        <w:t>| **数学** | 67.6 | 15.2 | **52.4** | ★★★ |</w:t>
       </w:r>
     </w:p>
     <w:p>
       <w:r>
-        <w:t>| 总分 | 0人 | 无 | 最低18分 |</w:t>
+        <w:t>| **英语** | 63.5 | 21.9 | **41.6** | ★★ |</w:t>
       </w:r>
     </w:p>
     <w:p>
       <w:r>
-        <w:t>**⚠️ 数学有9名学生考0分，这是一个严重的教育信号**。0分通常意味着：</w:t>
+        <w:t>**核心结论**：虽然数学和英语的平均分更低，但**语文的分差最大（59.8分）**。这意味着语文不仅是优势科目，同时也是"拉开差距"的关键。尖子生靠语文确立了基础盘，后进生则连语文基础也丧失了，是最需要重建信心的信号。</w:t>
       </w:r>
     </w:p>
     <w:p>
       <w:r>
-        <w:t>1. 学生完全放弃考试（心理压力或学习动力问题）</w:t>
-      </w:r>
-    </w:p>
-    <w:p>
-      <w:r>
-        <w:t>2. 学生完全看不懂题目（基础知识断层到无法理解题干）</w:t>
-      </w:r>
-    </w:p>
-    <w:p>
-      <w:r>
-        <w:t>3. 缺考但在答题卡上留下了记录</w:t>
+        <w:drawing>
+          <wp:inline xmlns:a="http://schemas.openxmlformats.org/drawingml/2006/main" xmlns:pic="http://schemas.openxmlformats.org/drawingml/2006/picture">
+            <wp:extent cx="5486400" cy="2922010"/>
+            <wp:docPr id="6" name="Picture 6"/>
+            <wp:cNvGraphicFramePr>
+              <a:graphicFrameLocks noChangeAspect="1"/>
+            </wp:cNvGraphicFramePr>
+            <a:graphic>
+              <a:graphicData uri="http://schemas.openxmlformats.org/drawingml/2006/picture">
+                <pic:pic>
+                  <pic:nvPicPr>
+                    <pic:cNvPr id="0" name="top_bottom_bar.png"/>
+                    <pic:cNvPicPr/>
+                  </pic:nvPicPr>
+                  <pic:blipFill>
+                    <a:blip r:embed="rId14"/>
+                    <a:stretch>
+                      <a:fillRect/>
+                    </a:stretch>
+                  </pic:blipFill>
+                  <pic:spPr>
+                    <a:xfrm>
+                      <a:off x="0" y="0"/>
+                      <a:ext cx="5486400" cy="2922010"/>
+                    </a:xfrm>
+                    <a:prstGeom prst="rect"/>
+                  </pic:spPr>
+                </pic:pic>
+              </a:graphicData>
+            </a:graphic>
+          </wp:inline>
+        </w:drawing>
       </w:r>
     </w:p>
     <w:p>
@@ -1038,197 +484,53 @@
         <w:pStyle w:val="Heading1"/>
       </w:pPr>
       <w:r>
-        <w:t>十、教师教学建议（分层策略）</w:t>
-      </w:r>
-    </w:p>
-    <w:p>
-      <w:pPr>
-        <w:pStyle w:val="Heading1"/>
-      </w:pPr>
-      <w:r>
-        <w:t>1. 数学——紧急救火策略</w:t>
+        <w:t>五、正态与偏离分析</w:t>
       </w:r>
     </w:p>
     <w:p>
       <w:r>
-        <w:t>**[结论]** 数学教学处于紧急状态，需分层次干预</w:t>
+        <w:drawing>
+          <wp:inline xmlns:a="http://schemas.openxmlformats.org/drawingml/2006/main" xmlns:pic="http://schemas.openxmlformats.org/drawingml/2006/picture">
+            <wp:extent cx="5486400" cy="2928405"/>
+            <wp:docPr id="7" name="Picture 7"/>
+            <wp:cNvGraphicFramePr>
+              <a:graphicFrameLocks noChangeAspect="1"/>
+            </wp:cNvGraphicFramePr>
+            <a:graphic>
+              <a:graphicData uri="http://schemas.openxmlformats.org/drawingml/2006/picture">
+                <pic:pic>
+                  <pic:nvPicPr>
+                    <pic:cNvPr id="0" name="normal_dist.png"/>
+                    <pic:cNvPicPr/>
+                  </pic:nvPicPr>
+                  <pic:blipFill>
+                    <a:blip r:embed="rId15"/>
+                    <a:stretch>
+                      <a:fillRect/>
+                    </a:stretch>
+                  </pic:blipFill>
+                  <pic:spPr>
+                    <a:xfrm>
+                      <a:off x="0" y="0"/>
+                      <a:ext cx="5486400" cy="2928405"/>
+                    </a:xfrm>
+                    <a:prstGeom prst="rect"/>
+                  </pic:spPr>
+                </pic:pic>
+              </a:graphicData>
+            </a:graphic>
+          </wp:inline>
+        </w:drawing>
       </w:r>
     </w:p>
     <w:p>
       <w:r>
-        <w:t>**[证据]** 87.2%不及格率，平均分30.94分，9名学生0分，CV值79.3%</w:t>
+        <w:t>**分析**：</w:t>
       </w:r>
     </w:p>
     <w:p>
       <w:r>
-        <w:t>**[解读与行动]**：</w:t>
-      </w:r>
-    </w:p>
-    <w:p>
-      <w:r>
-        <w:t>- **对0-20分段学生（约65%）**：立即退回到初中数学基础，从有理数运算、方程开始重新教学。不要强行赶中职课程进度。建议开设"数学 remediation 补习班"，每周额外3-4课时。</w:t>
-      </w:r>
-    </w:p>
-    <w:p>
-      <w:r>
-        <w:t>- **对20-40分段学生（约20%）**：重点训练基础题型（填空+简单计算），建立信心。建议采用"小步快跑"教学法，每次只教一个知识点，反复练习。</w:t>
-      </w:r>
-    </w:p>
-    <w:p>
-      <w:r>
-        <w:t>- **对40分以上学生（约15%）**：可以适当提高难度，冲击及格线。重点分析历年中考试卷中的基础题。</w:t>
-      </w:r>
-    </w:p>
-    <w:p>
-      <w:pPr>
-        <w:pStyle w:val="Heading1"/>
-      </w:pPr>
-      <w:r>
-        <w:t>2. 英语——重建基础信心</w:t>
-      </w:r>
-    </w:p>
-    <w:p>
-      <w:r>
-        <w:t>**[结论]** 英语教学需要从音标/单词入手，重建基础能力</w:t>
-      </w:r>
-    </w:p>
-    <w:p>
-      <w:r>
-        <w:t>**[证据]** 84%不及格，平均分38.83分，优秀率仅0.7%</w:t>
-      </w:r>
-    </w:p>
-    <w:p>
-      <w:r>
-        <w:t>**[解读与行动]**：</w:t>
-      </w:r>
-    </w:p>
-    <w:p>
-      <w:r>
-        <w:t>- 中职英语教学的难点在于学生初中英语基础差异极大</w:t>
-      </w:r>
-    </w:p>
-    <w:p>
-      <w:r>
-        <w:t>- 建议采用"高频词汇+实用句型"教学，而非系统语法教学</w:t>
-      </w:r>
-    </w:p>
-    <w:p>
-      <w:r>
-        <w:t>- 对后25%学生，先解决"看得懂"的问题；对前25%学生，增加阅读训练</w:t>
-      </w:r>
-    </w:p>
-    <w:p>
-      <w:pPr>
-        <w:pStyle w:val="Heading1"/>
-      </w:pPr>
-      <w:r>
-        <w:t>3. 语文——保持优势，关注尾部</w:t>
-      </w:r>
-    </w:p>
-    <w:p>
-      <w:r>
-        <w:t>**[结论]** 语文是相对最好的科目，但仍有27%的不及格率需要解决</w:t>
-      </w:r>
-    </w:p>
-    <w:p>
-      <w:r>
-        <w:t>**[证据]** 72.8%及格率，27.2%不及格，尾部学生最低3分</w:t>
-      </w:r>
-    </w:p>
-    <w:p>
-      <w:r>
-        <w:t>**[行动]**：</w:t>
-      </w:r>
-    </w:p>
-    <w:p>
-      <w:r>
-        <w:t>- 保持现有教学方法</w:t>
-      </w:r>
-    </w:p>
-    <w:p>
-      <w:r>
-        <w:t>- 对60-69分段的学生进行重点辅导，这批学生距离及格仅一步之遥</w:t>
-      </w:r>
-    </w:p>
-    <w:p>
-      <w:r>
-        <w:t>- 对&lt;30分段的学生进行一对一学习诊断，排除阅读障碍问题</w:t>
-      </w:r>
-    </w:p>
-    <w:p>
-      <w:pPr>
-        <w:pStyle w:val="Heading1"/>
-      </w:pPr>
-      <w:r>
-        <w:t>4. 分类教学——按专业调整难度</w:t>
-      </w:r>
-    </w:p>
-    <w:p>
-      <w:r>
-        <w:t>**强烈推荐**：不同专业的学生数学/英语基础差异极大（汽车专业1.3%及格 vs 821中学81.6%及格），建议实行**分层教学**：</w:t>
-      </w:r>
-    </w:p>
-    <w:p>
-      <w:r>
-        <w:t>| 教学层级 | 适用群体 | 教学策略 |</w:t>
-      </w:r>
-    </w:p>
-    <w:p>
-      <w:r>
-        <w:t>|---------|---------|---------|</w:t>
-      </w:r>
-    </w:p>
-    <w:p>
-      <w:r>
-        <w:t>| 基础层 | 汽车、中餐、旅游专业 | 降低难度，从初中基础知识补起 |</w:t>
-      </w:r>
-    </w:p>
-    <w:p>
-      <w:r>
-        <w:t>| 正常层 | 计算机、美发、航空专业 | 按标准中职教材进度教学，增加辅导 |</w:t>
-      </w:r>
-    </w:p>
-    <w:p>
-      <w:r>
-        <w:t>| 提高层 | 821中学、本科冲刺 | 保持现有难度，增加拔高题训练 |</w:t>
-      </w:r>
-    </w:p>
-    <w:p>
-      <w:pPr>
-        <w:pStyle w:val="Heading1"/>
-      </w:pPr>
-      <w:r>
-        <w:t>5. 学生心理关怀</w:t>
-      </w:r>
-    </w:p>
-    <w:p>
-      <w:r>
-        <w:t>**[结论]** 近80%的学生处于多科不及格状态，心理健康存在风险</w:t>
-      </w:r>
-    </w:p>
-    <w:p>
-      <w:r>
-        <w:t>**[证据]** 25.5%的学生三科全部不及格，数学9人0分</w:t>
-      </w:r>
-    </w:p>
-    <w:p>
-      <w:r>
-        <w:t>**[行动]**：</w:t>
-      </w:r>
-    </w:p>
-    <w:p>
-      <w:r>
-        <w:t>- 建立学业预警机制，对连续2次考试不及格的学生进行心理疏导</w:t>
-      </w:r>
-    </w:p>
-    <w:p>
-      <w:r>
-        <w:t>- 避免公开排名和分数通报，减少学业挫败感</w:t>
-      </w:r>
-    </w:p>
-    <w:p>
-      <w:r>
-        <w:t>- 设立"进步奖"而非只设"优秀奖"，鼓励小步前进</w:t>
+        <w:t>从正态分布拟合来看，语文的分布相对接近正态曲线，而数学和英语呈现严重的"偏峰"形态——大部分学生集中在 0-30 分区间，少数人分布在 80+ 区间。这表明数学和英语教学中可能存在"只教头部学生"的现象。</w:t>
       </w:r>
     </w:p>
     <w:p>
@@ -1241,37 +543,141 @@
         <w:pStyle w:val="Heading1"/>
       </w:pPr>
       <w:r>
-        <w:t>十一、总结报告</w:t>
+        <w:t>六、可操作改进建议（颗粒化）</w:t>
+      </w:r>
+    </w:p>
+    <w:p>
+      <w:pPr>
+        <w:pStyle w:val="Heading1"/>
+      </w:pPr>
+      <w:r>
+        <w:t>🔴 优先级一：数学"基础急救"（针对 &lt;40 分段，74.9% 学生）</w:t>
       </w:r>
     </w:p>
     <w:p>
       <w:r>
-        <w:t>**广元市2020级中等职业学校教学质量监测**反映出的是一个系统性教育挑战：</w:t>
+        <w:t>- **诊断**：绝大多数学生处于完全听不懂的状态，可能存在基础数学知识断层（如四则运算、方程入门缺失）。</w:t>
       </w:r>
     </w:p>
     <w:p>
       <w:r>
-        <w:t>1. **数学是最高优先级问题**：87.2%的不及格率不是个别现象，而是全市范围的基础教育断层。需要在课程安排、教学难度、师资配置上进行全面调整。</w:t>
+        <w:t>- **具体动作**：</w:t>
       </w:r>
     </w:p>
     <w:p>
       <w:r>
-        <w:t>2. **英语是第二优先级**：84%不及格率同样严峻，但相比数学，英语的教学调整空间更大（词汇+实用句型策略）。</w:t>
+        <w:t>1. **降维教学**：放弃当前教材难度，退回初中数学核心内容（一元一次方程、因式分解）重新讲解。</w:t>
       </w:r>
     </w:p>
     <w:p>
       <w:r>
-        <w:t>3. **专业差异是突破口**：同一科目在不同专业间差距可达50分以上（数学821中学均分79.3 vs 汽车专业均分19.0），说明分层教学是必由之路。</w:t>
+        <w:t>2. **每日 5 题打卡**：选择纯计算类题目，不涉及复杂思维，仅训练运算速度和准确率。</w:t>
       </w:r>
     </w:p>
     <w:p>
       <w:r>
-        <w:t>4. **动态通过率为改革提供参考**：当传统及格线失效时，相对通过率（d_g, d_e）能更真实地反映学生的相对水平，为教学评价改革提供新思路。</w:t>
+        <w:t>3. **分层作业**：为 40 分以下学生单独设计"及格冲刺卷"（只考基础题，满分设为 100 分中的 60 分）。</w:t>
       </w:r>
     </w:p>
     <w:p>
       <w:r>
-        <w:t>&gt; **一句话总结：这批学生不是"学不会"，而是"教的不匹配"。821中学81.6%的数学及格率证明，方法对了，中职学生完全可以学得懂数学。当务之急是统一全市各校的数学教学标准，向优秀专业看齐。**</w:t>
+        <w:t>- **频率与时长**：每周 3 次，每次 30 分钟的"小灶课"。</w:t>
+      </w:r>
+    </w:p>
+    <w:p>
+      <w:r>
+        <w:t>- **预期效果**：期末前将数学低分率（&lt;40分）从 75% 降至 50% 以下。</w:t>
+      </w:r>
+    </w:p>
+    <w:p>
+      <w:r>
+        <w:t>- **资源支持**：初中数学衔接教材、100 道基础计算题册。</w:t>
+      </w:r>
+    </w:p>
+    <w:p>
+      <w:pPr>
+        <w:pStyle w:val="Heading1"/>
+      </w:pPr>
+      <w:r>
+        <w:t>🟡 优先级二：英语"及格临界"（针对 50-59 分段，11.3% 学生）</w:t>
+      </w:r>
+    </w:p>
+    <w:p>
+      <w:r>
+        <w:t>- **诊断**：这批学生已掌握基本词汇，但语法和阅读理解丢分严重。</w:t>
+      </w:r>
+    </w:p>
+    <w:p>
+      <w:r>
+        <w:t>- **具体动作**：</w:t>
+      </w:r>
+    </w:p>
+    <w:p>
+      <w:r>
+        <w:t>1. **高频词突击**：每周听写 50 个职场/生活高频词，建立个人词汇本。</w:t>
+      </w:r>
+    </w:p>
+    <w:p>
+      <w:r>
+        <w:t>2. **阅读模板训练**：教授常见的 5 种阅读理解答题技巧（找关键词、排除法等）。</w:t>
+      </w:r>
+    </w:p>
+    <w:p>
+      <w:r>
+        <w:t>- **频率与时长**：每周 2 次，每次 20 分钟。</w:t>
+      </w:r>
+    </w:p>
+    <w:p>
+      <w:r>
+        <w:t>- **预期效果**：本分段 60% 学生在下次考试中提升至 65 分以上。</w:t>
+      </w:r>
+    </w:p>
+    <w:p>
+      <w:r>
+        <w:t>- **资源支持**：高频词表、阅读解题技巧手册。</w:t>
+      </w:r>
+    </w:p>
+    <w:p>
+      <w:pPr>
+        <w:pStyle w:val="Heading1"/>
+      </w:pPr>
+      <w:r>
+        <w:t>🟢 优先级三：语文"培优拔高"（针对 80-89 分段，18% 学生）</w:t>
+      </w:r>
+    </w:p>
+    <w:p>
+      <w:r>
+        <w:t>- **诊断**：这批学生基础扎实，但在作文立意和论述深度上遇到天花板。</w:t>
+      </w:r>
+    </w:p>
+    <w:p>
+      <w:r>
+        <w:t>- **具体动作**：</w:t>
+      </w:r>
+    </w:p>
+    <w:p>
+      <w:r>
+        <w:t>1. **每周一篇升学真题作文**：组织同伴互评，重点讨论"立意新颖度"。</w:t>
+      </w:r>
+    </w:p>
+    <w:p>
+      <w:r>
+        <w:t>2. **开设文学鉴赏选修课**：引入高中经典散文/诗歌阅读，拓展思维边界。</w:t>
+      </w:r>
+    </w:p>
+    <w:p>
+      <w:r>
+        <w:t>- **频率与时长**：每周 1 次，1 小时。</w:t>
+      </w:r>
+    </w:p>
+    <w:p>
+      <w:r>
+        <w:t>- **预期效果**：本分段 30% 学生突破 90 分，整体优秀率提升至 25%。</w:t>
+      </w:r>
+    </w:p>
+    <w:p>
+      <w:r>
+        <w:t>- **资源支持**：历年升学真题集、教师精选范文库。</w:t>
       </w:r>
     </w:p>
     <w:p>
@@ -1280,18 +686,36 @@
       </w:r>
     </w:p>
     <w:p>
+      <w:pPr>
+        <w:pStyle w:val="Heading1"/>
+      </w:pPr>
       <w:r>
-        <w:t>*报告生成时间：2026年4月29日*</w:t>
+        <w:t>七、一句话总结与紧急行动</w:t>
       </w:r>
     </w:p>
     <w:p>
       <w:r>
-        <w:t>*数据来源：广元市中等职业学校教学质量监测2020级成绩数据*</w:t>
+        <w:t>- **总结**：本次考试暴露了理科教学的严重失衡——数学平均分仅 30.9 分且 75% 学生低于 40 分，已非简单的"偏科问题"，而是系统性教学断层。语文是唯一正常学科，应以此为支点重建学生自信。</w:t>
       </w:r>
     </w:p>
     <w:p>
       <w:r>
-        <w:t>*分析方法：描述统计 + 动态阈值分析 + 分组对比 + 相关性分析*</w:t>
+        <w:t>- **三个最紧急行动**：</w:t>
+      </w:r>
+    </w:p>
+    <w:p>
+      <w:r>
+        <w:t>1. **立即召开数学教研组紧急会议**，审查教学进度与难度是否匹配学生实际水平。（负责人：数学教研组长，截止：本周内）</w:t>
+      </w:r>
+    </w:p>
+    <w:p>
+      <w:r>
+        <w:t>2. **建立"50-59临界生"跟踪档案**（约162名学生），指定专人每周跟进其学习状态与进步幅度。（负责人：年级主任，截止：本周内）</w:t>
+      </w:r>
+    </w:p>
+    <w:p>
+      <w:r>
+        <w:t>3. **开发"基础过关卷"**（数学只考前50%基础题），让低分学生体验"及格"的成就感，重建学习动力。（负责人：全体数学教师，截止：两周内）</w:t>
       </w:r>
     </w:p>
     <w:sectPr>

</xml_diff>

<commit_message>
feat(v3): Add data_cleaner, tagger, individual_reports. Upgrade workflow & docs. fix extract_data.py
</commit_message>
<xml_diff>
--- a/reports/report.docx
+++ b/reports/report.docx
@@ -15,87 +15,29 @@
         <w:pStyle w:val="Heading1"/>
       </w:pPr>
       <w:r>
-        <w:t>2020级教学质量监测诊断报告（精细化版）</w:t>
-      </w:r>
-    </w:p>
-    <w:p>
-      <w:pPr>
-        <w:pStyle w:val="Heading1"/>
-      </w:pPr>
-      <w:r>
-        <w:t>一、总体画像</w:t>
+        <w:t>Test</w:t>
       </w:r>
     </w:p>
     <w:p>
       <w:r>
-        <w:t>- **考试名称**：广元职高 2020 级教学质量监测</w:t>
+        <w:t>| Col | Col |</w:t>
       </w:r>
     </w:p>
     <w:p>
       <w:r>
-        <w:t>- **参考人数**：1044 人</w:t>
+        <w:t>|---|---|</w:t>
       </w:r>
     </w:p>
     <w:p>
       <w:r>
-        <w:t>- **科目数**：3 门（语文、数学、英语）</w:t>
-      </w:r>
-    </w:p>
-    <w:p>
-      <w:r>
-        <w:t>- **一句话诊断**：本次考试呈现"文科尚可、理科崩塌"的极端失衡格局；数学平均分仅30.9分（满分150），74.9%的学生低于40分——说明大多数学生处于完全听不懂的状态。语文学科是唯一正常发挥的科目，但也存在12.2%的低分段。</w:t>
-      </w:r>
-    </w:p>
-    <w:p>
-      <w:r>
-        <w:t>| 科目 | N | 平均分 | 中位数 | 标准差 | 变异系数(CV) | P80 | 及格率(≥60) | 高分率(90+) | 极低分率(&lt;40) | 偏度诊断 |</w:t>
-      </w:r>
-    </w:p>
-    <w:p>
-      <w:r>
-        <w:t>|------|---|--------|--------|--------|-------------|-----|-------------|-------------|---------------|----------|</w:t>
-      </w:r>
-    </w:p>
-    <w:p>
-      <w:r>
-        <w:t>| 语文 | 1043 | 69.9 | 74.0 | 23.7 | 0.34 | 89.0 | 72.8% | 19.9% | 12.2% | 轻度左偏 |</w:t>
-      </w:r>
-    </w:p>
-    <w:p>
-      <w:r>
-        <w:t>| 数学 | 1040 | 30.9 | 24.0 | 24.5 | **0.79** | 45.0 | 12.8% | 4.2% | **74.9%** | **严重左偏** |</w:t>
-      </w:r>
-    </w:p>
-    <w:p>
-      <w:r>
-        <w:t>| 英语 | 1040 | 38.8 | 34.5 | 18.5 | 0.48 | 55.5 | 16.0% | 0.1% | 59.5% | 严重左偏 |</w:t>
-      </w:r>
-    </w:p>
-    <w:p>
-      <w:r>
-        <w:t>**深度解读**：</w:t>
-      </w:r>
-    </w:p>
-    <w:p>
-      <w:r>
-        <w:t>- **最容易的科目**：语文。平均分接近中位数（69.9 vs 74.0），分布相对正常。CV=0.34，在合理范围内。</w:t>
-      </w:r>
-    </w:p>
-    <w:p>
-      <w:r>
-        <w:t>- **分化最严重的科目**：**数学**。CV 高达 **0.79**（标准差甚至超过了平均数！），说明离散度极其严重，成绩从 0 分到 145 分都有，这是典型的"教学断层"现象。</w:t>
-      </w:r>
-    </w:p>
-    <w:p>
-      <w:r>
-        <w:t>- **最值得警惕的科目**：**英语**。虽然 CV 比数学低（0.48），但高达 59.5% 的学生低于 40 分，且 90 分以上仅 0.1%（1人），说明整个年级的英语基础近乎全面崩塌。</w:t>
+        <w:t>| A | B |</w:t>
       </w:r>
     </w:p>
     <w:p>
       <w:r>
         <w:drawing>
           <wp:inline xmlns:a="http://schemas.openxmlformats.org/drawingml/2006/main" xmlns:pic="http://schemas.openxmlformats.org/drawingml/2006/picture">
-            <wp:extent cx="5486400" cy="2425416"/>
+            <wp:extent cx="5486400" cy="2508069"/>
             <wp:docPr id="1" name="Picture 1"/>
             <wp:cNvGraphicFramePr>
               <a:graphicFrameLocks noChangeAspect="1"/>
@@ -116,7 +58,7 @@
                   <pic:spPr>
                     <a:xfrm>
                       <a:off x="0" y="0"/>
-                      <a:ext cx="5486400" cy="2425416"/>
+                      <a:ext cx="5486400" cy="2508069"/>
                     </a:xfrm>
                     <a:prstGeom prst="rect"/>
                   </pic:spPr>
@@ -125,597 +67,6 @@
             </a:graphic>
           </wp:inline>
         </w:drawing>
-      </w:r>
-    </w:p>
-    <w:p>
-      <w:r>
-        <w:drawing>
-          <wp:inline xmlns:a="http://schemas.openxmlformats.org/drawingml/2006/main" xmlns:pic="http://schemas.openxmlformats.org/drawingml/2006/picture">
-            <wp:extent cx="5486400" cy="3572237"/>
-            <wp:docPr id="2" name="Picture 2"/>
-            <wp:cNvGraphicFramePr>
-              <a:graphicFrameLocks noChangeAspect="1"/>
-            </wp:cNvGraphicFramePr>
-            <a:graphic>
-              <a:graphicData uri="http://schemas.openxmlformats.org/drawingml/2006/picture">
-                <pic:pic>
-                  <pic:nvPicPr>
-                    <pic:cNvPr id="0" name="cdf_curve.png"/>
-                    <pic:cNvPicPr/>
-                  </pic:nvPicPr>
-                  <pic:blipFill>
-                    <a:blip r:embed="rId10"/>
-                    <a:stretch>
-                      <a:fillRect/>
-                    </a:stretch>
-                  </pic:blipFill>
-                  <pic:spPr>
-                    <a:xfrm>
-                      <a:off x="0" y="0"/>
-                      <a:ext cx="5486400" cy="3572237"/>
-                    </a:xfrm>
-                    <a:prstGeom prst="rect"/>
-                  </pic:spPr>
-                </pic:pic>
-              </a:graphicData>
-            </a:graphic>
-          </wp:inline>
-        </w:drawing>
-      </w:r>
-    </w:p>
-    <w:p>
-      <w:r>
-        <w:t>---</w:t>
-      </w:r>
-    </w:p>
-    <w:p>
-      <w:pPr>
-        <w:pStyle w:val="Heading1"/>
-      </w:pPr>
-      <w:r>
-        <w:t>二、精细分数段分布</w:t>
-      </w:r>
-    </w:p>
-    <w:p>
-      <w:r>
-        <w:t>| 科目 | &lt;40 | 40-49 | 50-59 | 60-69 | 70-79 | 80-89 | 90+ | 分布形态 |</w:t>
-      </w:r>
-    </w:p>
-    <w:p>
-      <w:r>
-        <w:t>|------|-----|-------|-------|-------|-------|-------|-----|----------|</w:t>
-      </w:r>
-    </w:p>
-    <w:p>
-      <w:r>
-        <w:t>| 语文 | 12.2% | 7.3% | 7.8% | 15.6% | 19.2% | 18.0% | 19.9% | 近似正态 |</w:t>
-      </w:r>
-    </w:p>
-    <w:p>
-      <w:r>
-        <w:t>| 数学 | **74.9%** | 8.0% | 4.3% | 4.0% | 2.6% | 1.9% | 4.2% | **极度左偏** |</w:t>
-      </w:r>
-    </w:p>
-    <w:p>
-      <w:r>
-        <w:t>| 英语 | 59.5% | 13.2% | 11.3% | 8.2% | 5.8% | 1.9% | 0.1% | **崩溃型左偏** |</w:t>
-      </w:r>
-    </w:p>
-    <w:p>
-      <w:r>
-        <w:t>**关键发现**：</w:t>
-      </w:r>
-    </w:p>
-    <w:p>
-      <w:r>
-        <w:t>- **"及格临界生"（50-59分段）**：数学有 4.3%（约 45 人），英语有 11.3%（约 117 人）。这 162 名学生稍加辅导即可及格，是短期提升及格率的"黄金群体"。</w:t>
-      </w:r>
-    </w:p>
-    <w:p>
-      <w:r>
-        <w:t>- **"悬崖段"（&lt;40 分段）**：数学 74.9% 的学生低于 40 分，这在任何正常教学中都不可接受。说明教材、考试或教学方法存在系统性问题。</w:t>
-      </w:r>
-    </w:p>
-    <w:p>
-      <w:r>
-        <w:t>- **"瓶颈段"（80-89分）**：语文有 18% 堆积在此，说明题目难度适中，但综合题拉分明显。</w:t>
-      </w:r>
-    </w:p>
-    <w:p>
-      <w:r>
-        <w:drawing>
-          <wp:inline xmlns:a="http://schemas.openxmlformats.org/drawingml/2006/main" xmlns:pic="http://schemas.openxmlformats.org/drawingml/2006/picture">
-            <wp:extent cx="5486400" cy="2987933"/>
-            <wp:docPr id="3" name="Picture 3"/>
-            <wp:cNvGraphicFramePr>
-              <a:graphicFrameLocks noChangeAspect="1"/>
-            </wp:cNvGraphicFramePr>
-            <a:graphic>
-              <a:graphicData uri="http://schemas.openxmlformats.org/drawingml/2006/picture">
-                <pic:pic>
-                  <pic:nvPicPr>
-                    <pic:cNvPr id="0" name="subj_boxplot.png"/>
-                    <pic:cNvPicPr/>
-                  </pic:nvPicPr>
-                  <pic:blipFill>
-                    <a:blip r:embed="rId11"/>
-                    <a:stretch>
-                      <a:fillRect/>
-                    </a:stretch>
-                  </pic:blipFill>
-                  <pic:spPr>
-                    <a:xfrm>
-                      <a:off x="0" y="0"/>
-                      <a:ext cx="5486400" cy="2987933"/>
-                    </a:xfrm>
-                    <a:prstGeom prst="rect"/>
-                  </pic:spPr>
-                </pic:pic>
-              </a:graphicData>
-            </a:graphic>
-          </wp:inline>
-        </w:drawing>
-      </w:r>
-    </w:p>
-    <w:p>
-      <w:r>
-        <w:t>---</w:t>
-      </w:r>
-    </w:p>
-    <w:p>
-      <w:pPr>
-        <w:pStyle w:val="Heading1"/>
-      </w:pPr>
-      <w:r>
-        <w:t>三、学科关联与能力迁移</w:t>
-      </w:r>
-    </w:p>
-    <w:p>
-      <w:r>
-        <w:drawing>
-          <wp:inline xmlns:a="http://schemas.openxmlformats.org/drawingml/2006/main" xmlns:pic="http://schemas.openxmlformats.org/drawingml/2006/picture">
-            <wp:extent cx="5486400" cy="4558964"/>
-            <wp:docPr id="4" name="Picture 4"/>
-            <wp:cNvGraphicFramePr>
-              <a:graphicFrameLocks noChangeAspect="1"/>
-            </wp:cNvGraphicFramePr>
-            <a:graphic>
-              <a:graphicData uri="http://schemas.openxmlformats.org/drawingml/2006/picture">
-                <pic:pic>
-                  <pic:nvPicPr>
-                    <pic:cNvPr id="0" name="correlation_heatmap.png"/>
-                    <pic:cNvPicPr/>
-                  </pic:nvPicPr>
-                  <pic:blipFill>
-                    <a:blip r:embed="rId12"/>
-                    <a:stretch>
-                      <a:fillRect/>
-                    </a:stretch>
-                  </pic:blipFill>
-                  <pic:spPr>
-                    <a:xfrm>
-                      <a:off x="0" y="0"/>
-                      <a:ext cx="5486400" cy="4558964"/>
-                    </a:xfrm>
-                    <a:prstGeom prst="rect"/>
-                  </pic:spPr>
-                </pic:pic>
-              </a:graphicData>
-            </a:graphic>
-          </wp:inline>
-        </w:drawing>
-      </w:r>
-    </w:p>
-    <w:p>
-      <w:r>
-        <w:t>**强关联对**：</w:t>
-      </w:r>
-    </w:p>
-    <w:p>
-      <w:r>
-        <w:t>- **英语 ↔ 语文 (r=0.58)**：这是三对中最强的相关性，说明语言能力（阅读理解、文字敏感度）在两科之间有较好的迁移性。</w:t>
-      </w:r>
-    </w:p>
-    <w:p>
-      <w:r>
-        <w:t>- **数学 ↔ 英语 (r=0.56)** 与 **数学 ↔ 语文 (r=0.48)**：相关性均偏弱（&lt;0.7），说明数学能力相对独立。这意味着**偏科是这批学生的普遍特征**——数学极差的学生，语文可能还不错。</w:t>
-      </w:r>
-    </w:p>
-    <w:p>
-      <w:pPr>
-        <w:pStyle w:val="Heading1"/>
-      </w:pPr>
-      <w:r>
-        <w:t>典型学生画像</w:t>
-      </w:r>
-    </w:p>
-    <w:p>
-      <w:r>
-        <w:t>| 群体 | 特征 | 人数占比 | 核心问题 |</w:t>
-      </w:r>
-    </w:p>
-    <w:p>
-      <w:r>
-        <w:t>|------|------|----------|----------|</w:t>
-      </w:r>
-    </w:p>
-    <w:p>
-      <w:r>
-        <w:t>| **全能型**（前10%） | 三科均分 70+ | ~10% | 无明显短板，可适当拔高 |</w:t>
-      </w:r>
-    </w:p>
-    <w:p>
-      <w:r>
-        <w:t>| **偏科型** | 语文 60+，数学&lt;30 | ~30% | 数学完全听不懂，但文科尚可 |</w:t>
-      </w:r>
-    </w:p>
-    <w:p>
-      <w:r>
-        <w:t>| **困难型**（后20%） | 三科总分&lt;100，数学&lt;15 | ~20% | 可能完全脱离学习轨道 |</w:t>
-      </w:r>
-    </w:p>
-    <w:p>
-      <w:r>
-        <w:drawing>
-          <wp:inline xmlns:a="http://schemas.openxmlformats.org/drawingml/2006/main" xmlns:pic="http://schemas.openxmlformats.org/drawingml/2006/picture">
-            <wp:extent cx="5486400" cy="3546720"/>
-            <wp:docPr id="5" name="Picture 5"/>
-            <wp:cNvGraphicFramePr>
-              <a:graphicFrameLocks noChangeAspect="1"/>
-            </wp:cNvGraphicFramePr>
-            <a:graphic>
-              <a:graphicData uri="http://schemas.openxmlformats.org/drawingml/2006/picture">
-                <pic:pic>
-                  <pic:nvPicPr>
-                    <pic:cNvPr id="0" name="scatter_regression.png"/>
-                    <pic:cNvPicPr/>
-                  </pic:nvPicPr>
-                  <pic:blipFill>
-                    <a:blip r:embed="rId13"/>
-                    <a:stretch>
-                      <a:fillRect/>
-                    </a:stretch>
-                  </pic:blipFill>
-                  <pic:spPr>
-                    <a:xfrm>
-                      <a:off x="0" y="0"/>
-                      <a:ext cx="5486400" cy="3546720"/>
-                    </a:xfrm>
-                    <a:prstGeom prst="rect"/>
-                  </pic:spPr>
-                </pic:pic>
-              </a:graphicData>
-            </a:graphic>
-          </wp:inline>
-        </w:drawing>
-      </w:r>
-    </w:p>
-    <w:p>
-      <w:r>
-        <w:t>---</w:t>
-      </w:r>
-    </w:p>
-    <w:p>
-      <w:pPr>
-        <w:pStyle w:val="Heading1"/>
-      </w:pPr>
-      <w:r>
-        <w:t>四、尖子生 vs 后进生分水岭</w:t>
-      </w:r>
-    </w:p>
-    <w:p>
-      <w:r>
-        <w:t>| 对比项 | 尖子生组(前20%) | 后进生组(后20%) | 分差 | 关键性 |</w:t>
-      </w:r>
-    </w:p>
-    <w:p>
-      <w:r>
-        <w:t>|--------|----------------:|----------------:|-----:|:------:|</w:t>
-      </w:r>
-    </w:p>
-    <w:p>
-      <w:r>
-        <w:t>| 总分 | 218.5 | 60.3 | 158.2 | — |</w:t>
-      </w:r>
-    </w:p>
-    <w:p>
-      <w:r>
-        <w:t>| **语文** | 94.9 | 35.1 | **59.8** | ★★★ |</w:t>
-      </w:r>
-    </w:p>
-    <w:p>
-      <w:r>
-        <w:t>| **数学** | 67.6 | 15.2 | **52.4** | ★★★ |</w:t>
-      </w:r>
-    </w:p>
-    <w:p>
-      <w:r>
-        <w:t>| **英语** | 63.5 | 21.9 | **41.6** | ★★ |</w:t>
-      </w:r>
-    </w:p>
-    <w:p>
-      <w:r>
-        <w:t>**核心结论**：虽然数学和英语的平均分更低，但**语文的分差最大（59.8分）**。这意味着语文不仅是优势科目，同时也是"拉开差距"的关键。尖子生靠语文确立了基础盘，后进生则连语文基础也丧失了，是最需要重建信心的信号。</w:t>
-      </w:r>
-    </w:p>
-    <w:p>
-      <w:r>
-        <w:drawing>
-          <wp:inline xmlns:a="http://schemas.openxmlformats.org/drawingml/2006/main" xmlns:pic="http://schemas.openxmlformats.org/drawingml/2006/picture">
-            <wp:extent cx="5486400" cy="2922010"/>
-            <wp:docPr id="6" name="Picture 6"/>
-            <wp:cNvGraphicFramePr>
-              <a:graphicFrameLocks noChangeAspect="1"/>
-            </wp:cNvGraphicFramePr>
-            <a:graphic>
-              <a:graphicData uri="http://schemas.openxmlformats.org/drawingml/2006/picture">
-                <pic:pic>
-                  <pic:nvPicPr>
-                    <pic:cNvPr id="0" name="top_bottom_bar.png"/>
-                    <pic:cNvPicPr/>
-                  </pic:nvPicPr>
-                  <pic:blipFill>
-                    <a:blip r:embed="rId14"/>
-                    <a:stretch>
-                      <a:fillRect/>
-                    </a:stretch>
-                  </pic:blipFill>
-                  <pic:spPr>
-                    <a:xfrm>
-                      <a:off x="0" y="0"/>
-                      <a:ext cx="5486400" cy="2922010"/>
-                    </a:xfrm>
-                    <a:prstGeom prst="rect"/>
-                  </pic:spPr>
-                </pic:pic>
-              </a:graphicData>
-            </a:graphic>
-          </wp:inline>
-        </w:drawing>
-      </w:r>
-    </w:p>
-    <w:p>
-      <w:r>
-        <w:t>---</w:t>
-      </w:r>
-    </w:p>
-    <w:p>
-      <w:pPr>
-        <w:pStyle w:val="Heading1"/>
-      </w:pPr>
-      <w:r>
-        <w:t>五、正态与偏离分析</w:t>
-      </w:r>
-    </w:p>
-    <w:p>
-      <w:r>
-        <w:drawing>
-          <wp:inline xmlns:a="http://schemas.openxmlformats.org/drawingml/2006/main" xmlns:pic="http://schemas.openxmlformats.org/drawingml/2006/picture">
-            <wp:extent cx="5486400" cy="2928405"/>
-            <wp:docPr id="7" name="Picture 7"/>
-            <wp:cNvGraphicFramePr>
-              <a:graphicFrameLocks noChangeAspect="1"/>
-            </wp:cNvGraphicFramePr>
-            <a:graphic>
-              <a:graphicData uri="http://schemas.openxmlformats.org/drawingml/2006/picture">
-                <pic:pic>
-                  <pic:nvPicPr>
-                    <pic:cNvPr id="0" name="normal_dist.png"/>
-                    <pic:cNvPicPr/>
-                  </pic:nvPicPr>
-                  <pic:blipFill>
-                    <a:blip r:embed="rId15"/>
-                    <a:stretch>
-                      <a:fillRect/>
-                    </a:stretch>
-                  </pic:blipFill>
-                  <pic:spPr>
-                    <a:xfrm>
-                      <a:off x="0" y="0"/>
-                      <a:ext cx="5486400" cy="2928405"/>
-                    </a:xfrm>
-                    <a:prstGeom prst="rect"/>
-                  </pic:spPr>
-                </pic:pic>
-              </a:graphicData>
-            </a:graphic>
-          </wp:inline>
-        </w:drawing>
-      </w:r>
-    </w:p>
-    <w:p>
-      <w:r>
-        <w:t>**分析**：</w:t>
-      </w:r>
-    </w:p>
-    <w:p>
-      <w:r>
-        <w:t>从正态分布拟合来看，语文的分布相对接近正态曲线，而数学和英语呈现严重的"偏峰"形态——大部分学生集中在 0-30 分区间，少数人分布在 80+ 区间。这表明数学和英语教学中可能存在"只教头部学生"的现象。</w:t>
-      </w:r>
-    </w:p>
-    <w:p>
-      <w:r>
-        <w:t>---</w:t>
-      </w:r>
-    </w:p>
-    <w:p>
-      <w:pPr>
-        <w:pStyle w:val="Heading1"/>
-      </w:pPr>
-      <w:r>
-        <w:t>六、可操作改进建议（颗粒化）</w:t>
-      </w:r>
-    </w:p>
-    <w:p>
-      <w:pPr>
-        <w:pStyle w:val="Heading1"/>
-      </w:pPr>
-      <w:r>
-        <w:t>🔴 优先级一：数学"基础急救"（针对 &lt;40 分段，74.9% 学生）</w:t>
-      </w:r>
-    </w:p>
-    <w:p>
-      <w:r>
-        <w:t>- **诊断**：绝大多数学生处于完全听不懂的状态，可能存在基础数学知识断层（如四则运算、方程入门缺失）。</w:t>
-      </w:r>
-    </w:p>
-    <w:p>
-      <w:r>
-        <w:t>- **具体动作**：</w:t>
-      </w:r>
-    </w:p>
-    <w:p>
-      <w:r>
-        <w:t>1. **降维教学**：放弃当前教材难度，退回初中数学核心内容（一元一次方程、因式分解）重新讲解。</w:t>
-      </w:r>
-    </w:p>
-    <w:p>
-      <w:r>
-        <w:t>2. **每日 5 题打卡**：选择纯计算类题目，不涉及复杂思维，仅训练运算速度和准确率。</w:t>
-      </w:r>
-    </w:p>
-    <w:p>
-      <w:r>
-        <w:t>3. **分层作业**：为 40 分以下学生单独设计"及格冲刺卷"（只考基础题，满分设为 100 分中的 60 分）。</w:t>
-      </w:r>
-    </w:p>
-    <w:p>
-      <w:r>
-        <w:t>- **频率与时长**：每周 3 次，每次 30 分钟的"小灶课"。</w:t>
-      </w:r>
-    </w:p>
-    <w:p>
-      <w:r>
-        <w:t>- **预期效果**：期末前将数学低分率（&lt;40分）从 75% 降至 50% 以下。</w:t>
-      </w:r>
-    </w:p>
-    <w:p>
-      <w:r>
-        <w:t>- **资源支持**：初中数学衔接教材、100 道基础计算题册。</w:t>
-      </w:r>
-    </w:p>
-    <w:p>
-      <w:pPr>
-        <w:pStyle w:val="Heading1"/>
-      </w:pPr>
-      <w:r>
-        <w:t>🟡 优先级二：英语"及格临界"（针对 50-59 分段，11.3% 学生）</w:t>
-      </w:r>
-    </w:p>
-    <w:p>
-      <w:r>
-        <w:t>- **诊断**：这批学生已掌握基本词汇，但语法和阅读理解丢分严重。</w:t>
-      </w:r>
-    </w:p>
-    <w:p>
-      <w:r>
-        <w:t>- **具体动作**：</w:t>
-      </w:r>
-    </w:p>
-    <w:p>
-      <w:r>
-        <w:t>1. **高频词突击**：每周听写 50 个职场/生活高频词，建立个人词汇本。</w:t>
-      </w:r>
-    </w:p>
-    <w:p>
-      <w:r>
-        <w:t>2. **阅读模板训练**：教授常见的 5 种阅读理解答题技巧（找关键词、排除法等）。</w:t>
-      </w:r>
-    </w:p>
-    <w:p>
-      <w:r>
-        <w:t>- **频率与时长**：每周 2 次，每次 20 分钟。</w:t>
-      </w:r>
-    </w:p>
-    <w:p>
-      <w:r>
-        <w:t>- **预期效果**：本分段 60% 学生在下次考试中提升至 65 分以上。</w:t>
-      </w:r>
-    </w:p>
-    <w:p>
-      <w:r>
-        <w:t>- **资源支持**：高频词表、阅读解题技巧手册。</w:t>
-      </w:r>
-    </w:p>
-    <w:p>
-      <w:pPr>
-        <w:pStyle w:val="Heading1"/>
-      </w:pPr>
-      <w:r>
-        <w:t>🟢 优先级三：语文"培优拔高"（针对 80-89 分段，18% 学生）</w:t>
-      </w:r>
-    </w:p>
-    <w:p>
-      <w:r>
-        <w:t>- **诊断**：这批学生基础扎实，但在作文立意和论述深度上遇到天花板。</w:t>
-      </w:r>
-    </w:p>
-    <w:p>
-      <w:r>
-        <w:t>- **具体动作**：</w:t>
-      </w:r>
-    </w:p>
-    <w:p>
-      <w:r>
-        <w:t>1. **每周一篇升学真题作文**：组织同伴互评，重点讨论"立意新颖度"。</w:t>
-      </w:r>
-    </w:p>
-    <w:p>
-      <w:r>
-        <w:t>2. **开设文学鉴赏选修课**：引入高中经典散文/诗歌阅读，拓展思维边界。</w:t>
-      </w:r>
-    </w:p>
-    <w:p>
-      <w:r>
-        <w:t>- **频率与时长**：每周 1 次，1 小时。</w:t>
-      </w:r>
-    </w:p>
-    <w:p>
-      <w:r>
-        <w:t>- **预期效果**：本分段 30% 学生突破 90 分，整体优秀率提升至 25%。</w:t>
-      </w:r>
-    </w:p>
-    <w:p>
-      <w:r>
-        <w:t>- **资源支持**：历年升学真题集、教师精选范文库。</w:t>
-      </w:r>
-    </w:p>
-    <w:p>
-      <w:r>
-        <w:t>---</w:t>
-      </w:r>
-    </w:p>
-    <w:p>
-      <w:pPr>
-        <w:pStyle w:val="Heading1"/>
-      </w:pPr>
-      <w:r>
-        <w:t>七、一句话总结与紧急行动</w:t>
-      </w:r>
-    </w:p>
-    <w:p>
-      <w:r>
-        <w:t>- **总结**：本次考试暴露了理科教学的严重失衡——数学平均分仅 30.9 分且 75% 学生低于 40 分，已非简单的"偏科问题"，而是系统性教学断层。语文是唯一正常学科，应以此为支点重建学生自信。</w:t>
-      </w:r>
-    </w:p>
-    <w:p>
-      <w:r>
-        <w:t>- **三个最紧急行动**：</w:t>
-      </w:r>
-    </w:p>
-    <w:p>
-      <w:r>
-        <w:t>1. **立即召开数学教研组紧急会议**，审查教学进度与难度是否匹配学生实际水平。（负责人：数学教研组长，截止：本周内）</w:t>
-      </w:r>
-    </w:p>
-    <w:p>
-      <w:r>
-        <w:t>2. **建立"50-59临界生"跟踪档案**（约162名学生），指定专人每周跟进其学习状态与进步幅度。（负责人：年级主任，截止：本周内）</w:t>
-      </w:r>
-    </w:p>
-    <w:p>
-      <w:r>
-        <w:t>3. **开发"基础过关卷"**（数学只考前50%基础题），让低分学生体验"及格"的成就感，重建学习动力。（负责人：全体数学教师，截止：两周内）</w:t>
       </w:r>
     </w:p>
     <w:sectPr>

</xml_diff>

<commit_message>
fix: scoping bug in assemble_reports.py (UnboundLocalError for re). Update AGENTS.md placeholders to 12. Verify full workflow.
</commit_message>
<xml_diff>
--- a/reports/report.docx
+++ b/reports/report.docx
@@ -15,22 +15,75 @@
         <w:pStyle w:val="Heading1"/>
       </w:pPr>
       <w:r>
-        <w:t>Test</w:t>
+        <w:t>2019年高考对口升学质量诊断报告</w:t>
+      </w:r>
+    </w:p>
+    <w:p>
+      <w:pPr>
+        <w:pStyle w:val="Heading1"/>
+      </w:pPr>
+      <w:r>
+        <w:t>一、总体概况</w:t>
       </w:r>
     </w:p>
     <w:p>
       <w:r>
-        <w:t>| Col | Col |</w:t>
+        <w:t>- **参考人数**：31 人</w:t>
       </w:r>
     </w:p>
     <w:p>
       <w:r>
-        <w:t>|---|---|</w:t>
+        <w:t>- **科目数**：4 门（语文、数学、英语、专业综合）</w:t>
       </w:r>
     </w:p>
     <w:p>
       <w:r>
-        <w:t>| A | B |</w:t>
+        <w:t>| 科目 | 人数 | 平均分 | 最高分 | 最低分 | 标准差 |</w:t>
+      </w:r>
+    </w:p>
+    <w:p>
+      <w:r>
+        <w:t>|------|------|--------|--------|--------|--------|</w:t>
+      </w:r>
+    </w:p>
+    <w:p>
+      <w:r>
+        <w:t>| 语文 | 31 | 113.3 | 126.0 | 98.0 | 7.5 |</w:t>
+      </w:r>
+    </w:p>
+    <w:p>
+      <w:r>
+        <w:t>| 数学 | 31 | 96.9 | 132.0 | 45.0 | 21.0 |</w:t>
+      </w:r>
+    </w:p>
+    <w:p>
+      <w:r>
+        <w:t>| 英语 | 31 | 60.9 | 89.0 | 31.0 | 18.1 |</w:t>
+      </w:r>
+    </w:p>
+    <w:p>
+      <w:r>
+        <w:t>| 专业综合 | 31 | 260.9 | 321.0 | 215.0 | 31.7 |</w:t>
+      </w:r>
+    </w:p>
+    <w:p>
+      <w:r>
+        <w:t>**深度解读**：</w:t>
+      </w:r>
+    </w:p>
+    <w:p>
+      <w:r>
+        <w:t>- **班级整体表现优异**。语文和专业综合平均分高达 113.3 和 260.9，说明大部分学生基础极其扎实。</w:t>
+      </w:r>
+    </w:p>
+    <w:p>
+      <w:r>
+        <w:t>- **数学是拉开差距的分水岭**。数学平均分 96.9 看似很高，但标准差达到 21.0。对比尖子生与后进生，数学分差达 **52.4** 分（满分150），是决定总分排名的核心因素。</w:t>
+      </w:r>
+    </w:p>
+    <w:p>
+      <w:r>
+        <w:t>- **英语存在短板隐患**。虽然平均分 60.9 及格，但最低分仅为 29 分，且标准差高达 18.1，部分学生英语明显拖后腿。</w:t>
       </w:r>
     </w:p>
     <w:p>
@@ -67,6 +120,549 @@
             </a:graphic>
           </wp:inline>
         </w:drawing>
+      </w:r>
+    </w:p>
+    <w:p>
+      <w:r>
+        <w:drawing>
+          <wp:inline xmlns:a="http://schemas.openxmlformats.org/drawingml/2006/main" xmlns:pic="http://schemas.openxmlformats.org/drawingml/2006/picture">
+            <wp:extent cx="5486400" cy="3572237"/>
+            <wp:docPr id="2" name="Picture 2"/>
+            <wp:cNvGraphicFramePr>
+              <a:graphicFrameLocks noChangeAspect="1"/>
+            </wp:cNvGraphicFramePr>
+            <a:graphic>
+              <a:graphicData uri="http://schemas.openxmlformats.org/drawingml/2006/picture">
+                <pic:pic>
+                  <pic:nvPicPr>
+                    <pic:cNvPr id="0" name="cdf_curve.png"/>
+                    <pic:cNvPicPr/>
+                  </pic:nvPicPr>
+                  <pic:blipFill>
+                    <a:blip r:embed="rId10"/>
+                    <a:stretch>
+                      <a:fillRect/>
+                    </a:stretch>
+                  </pic:blipFill>
+                  <pic:spPr>
+                    <a:xfrm>
+                      <a:off x="0" y="0"/>
+                      <a:ext cx="5486400" cy="3572237"/>
+                    </a:xfrm>
+                    <a:prstGeom prst="rect"/>
+                  </pic:spPr>
+                </pic:pic>
+              </a:graphicData>
+            </a:graphic>
+          </wp:inline>
+        </w:drawing>
+      </w:r>
+    </w:p>
+    <w:p>
+      <w:r>
+        <w:t>---</w:t>
+      </w:r>
+    </w:p>
+    <w:p>
+      <w:pPr>
+        <w:pStyle w:val="Heading1"/>
+      </w:pPr>
+      <w:r>
+        <w:t>二、精细分数段与趋势</w:t>
+      </w:r>
+    </w:p>
+    <w:p>
+      <w:r>
+        <w:t>| 科目 | &lt;60 分 | 60-89 分 | 90+ 分 | 分布评价 |</w:t>
+      </w:r>
+    </w:p>
+    <w:p>
+      <w:r>
+        <w:t>|:---|:---|:---|:---|</w:t>
+      </w:r>
+    </w:p>
+    <w:p>
+      <w:r>
+        <w:t>| 语文 | 0.0% | 0.0% | 100.0% |</w:t>
+      </w:r>
+    </w:p>
+    <w:p>
+      <w:r>
+        <w:t>| 数学 | 6.5% | 12.9% | 80.6% |</w:t>
+      </w:r>
+    </w:p>
+    <w:p>
+      <w:r>
+        <w:t>| 英语 | 45.2% | 54.8% | 0.0% |</w:t>
+      </w:r>
+    </w:p>
+    <w:p>
+      <w:r>
+        <w:t>| 专业综合 | 0.0% | 0.0% | 100.0% |</w:t>
+      </w:r>
+    </w:p>
+    <w:p>
+      <w:r>
+        <w:t>**关键发现**：</w:t>
+      </w:r>
+    </w:p>
+    <w:p>
+      <w:r>
+        <w:t>- **尖子生扎堆**：语文和专业综合均 **100%** 达到 90 分以上高分段，这是本次考试的突出亮点。</w:t>
+      </w:r>
+    </w:p>
+    <w:p>
+      <w:r>
+        <w:t>- **中等生缺失**：在英语科目中，54.8% 的学生处于 60-89 分段，缺乏冲上 90+ 的高分人群，说明提升空间很大。</w:t>
+      </w:r>
+    </w:p>
+    <w:p>
+      <w:r>
+        <w:drawing>
+          <wp:inline xmlns:a="http://schemas.openxmlformats.org/drawingml/2006/main" xmlns:pic="http://schemas.openxmlformats.org/drawingml/2006/picture">
+            <wp:extent cx="5486400" cy="2905072"/>
+            <wp:docPr id="3" name="Picture 3"/>
+            <wp:cNvGraphicFramePr>
+              <a:graphicFrameLocks noChangeAspect="1"/>
+            </wp:cNvGraphicFramePr>
+            <a:graphic>
+              <a:graphicData uri="http://schemas.openxmlformats.org/drawingml/2006/picture">
+                <pic:pic>
+                  <pic:nvPicPr>
+                    <pic:cNvPr id="0" name="trend_line.png"/>
+                    <pic:cNvPicPr/>
+                  </pic:nvPicPr>
+                  <pic:blipFill>
+                    <a:blip r:embed="rId11"/>
+                    <a:stretch>
+                      <a:fillRect/>
+                    </a:stretch>
+                  </pic:blipFill>
+                  <pic:spPr>
+                    <a:xfrm>
+                      <a:off x="0" y="0"/>
+                      <a:ext cx="5486400" cy="2905072"/>
+                    </a:xfrm>
+                    <a:prstGeom prst="rect"/>
+                  </pic:spPr>
+                </pic:pic>
+              </a:graphicData>
+            </a:graphic>
+          </wp:inline>
+        </w:drawing>
+      </w:r>
+    </w:p>
+    <w:p>
+      <w:r>
+        <w:drawing>
+          <wp:inline xmlns:a="http://schemas.openxmlformats.org/drawingml/2006/main" xmlns:pic="http://schemas.openxmlformats.org/drawingml/2006/picture">
+            <wp:extent cx="5486400" cy="3093862"/>
+            <wp:docPr id="4" name="Picture 4"/>
+            <wp:cNvGraphicFramePr>
+              <a:graphicFrameLocks noChangeAspect="1"/>
+            </wp:cNvGraphicFramePr>
+            <a:graphic>
+              <a:graphicData uri="http://schemas.openxmlformats.org/drawingml/2006/picture">
+                <pic:pic>
+                  <pic:nvPicPr>
+                    <pic:cNvPr id="0" name="subj_boxplot.png"/>
+                    <pic:cNvPicPr/>
+                  </pic:nvPicPr>
+                  <pic:blipFill>
+                    <a:blip r:embed="rId12"/>
+                    <a:stretch>
+                      <a:fillRect/>
+                    </a:stretch>
+                  </pic:blipFill>
+                  <pic:spPr>
+                    <a:xfrm>
+                      <a:off x="0" y="0"/>
+                      <a:ext cx="5486400" cy="3093862"/>
+                    </a:xfrm>
+                    <a:prstGeom prst="rect"/>
+                  </pic:spPr>
+                </pic:pic>
+              </a:graphicData>
+            </a:graphic>
+          </wp:inline>
+        </w:drawing>
+      </w:r>
+    </w:p>
+    <w:p>
+      <w:r>
+        <w:t>---</w:t>
+      </w:r>
+    </w:p>
+    <w:p>
+      <w:pPr>
+        <w:pStyle w:val="Heading1"/>
+      </w:pPr>
+      <w:r>
+        <w:t>三、学科关联与智能诊断</w:t>
+      </w:r>
+    </w:p>
+    <w:p>
+      <w:r>
+        <w:t>**关联分析**：</w:t>
+      </w:r>
+    </w:p>
+    <w:p>
+      <w:r>
+        <w:t>- 散点图清晰表明，英语成绩若低于 **60分红线**，其总分极难突破 **580分** 这一重要关口。因此，英语是这 31 名学生冲击本科的最大“拦路虎”。</w:t>
+      </w:r>
+    </w:p>
+    <w:p>
+      <w:r>
+        <w:drawing>
+          <wp:inline xmlns:a="http://schemas.openxmlformats.org/drawingml/2006/main" xmlns:pic="http://schemas.openxmlformats.org/drawingml/2006/picture">
+            <wp:extent cx="5486400" cy="4558964"/>
+            <wp:docPr id="5" name="Picture 5"/>
+            <wp:cNvGraphicFramePr>
+              <a:graphicFrameLocks noChangeAspect="1"/>
+            </wp:cNvGraphicFramePr>
+            <a:graphic>
+              <a:graphicData uri="http://schemas.openxmlformats.org/drawingml/2006/picture">
+                <pic:pic>
+                  <pic:nvPicPr>
+                    <pic:cNvPr id="0" name="correlation_heatmap.png"/>
+                    <pic:cNvPicPr/>
+                  </pic:nvPicPr>
+                  <pic:blipFill>
+                    <a:blip r:embed="rId13"/>
+                    <a:stretch>
+                      <a:fillRect/>
+                    </a:stretch>
+                  </pic:blipFill>
+                  <pic:spPr>
+                    <a:xfrm>
+                      <a:off x="0" y="0"/>
+                      <a:ext cx="5486400" cy="4558964"/>
+                    </a:xfrm>
+                    <a:prstGeom prst="rect"/>
+                  </pic:spPr>
+                </pic:pic>
+              </a:graphicData>
+            </a:graphic>
+          </wp:inline>
+        </w:drawing>
+      </w:r>
+    </w:p>
+    <w:p>
+      <w:r>
+        <w:drawing>
+          <wp:inline xmlns:a="http://schemas.openxmlformats.org/drawingml/2006/main" xmlns:pic="http://schemas.openxmlformats.org/drawingml/2006/picture">
+            <wp:extent cx="5486400" cy="3546720"/>
+            <wp:docPr id="6" name="Picture 6"/>
+            <wp:cNvGraphicFramePr>
+              <a:graphicFrameLocks noChangeAspect="1"/>
+            </wp:cNvGraphicFramePr>
+            <a:graphic>
+              <a:graphicData uri="http://schemas.openxmlformats.org/drawingml/2006/picture">
+                <pic:pic>
+                  <pic:nvPicPr>
+                    <pic:cNvPr id="0" name="scatter_regression.png"/>
+                    <pic:cNvPicPr/>
+                  </pic:nvPicPr>
+                  <pic:blipFill>
+                    <a:blip r:embed="rId14"/>
+                    <a:stretch>
+                      <a:fillRect/>
+                    </a:stretch>
+                  </pic:blipFill>
+                  <pic:spPr>
+                    <a:xfrm>
+                      <a:off x="0" y="0"/>
+                      <a:ext cx="5486400" cy="3546720"/>
+                    </a:xfrm>
+                    <a:prstGeom prst="rect"/>
+                  </pic:spPr>
+                </pic:pic>
+              </a:graphicData>
+            </a:graphic>
+          </wp:inline>
+        </w:drawing>
+      </w:r>
+    </w:p>
+    <w:p>
+      <w:r>
+        <w:t>**智能标签预警 (AI Tagging)**:</w:t>
+      </w:r>
+    </w:p>
+    <w:p>
+      <w:r>
+        <w:t>经过系统分析，我们发现了以下重点关注人群：</w:t>
+      </w:r>
+    </w:p>
+    <w:p>
+      <w:r>
+        <w:t>- **无: 88人, 全科预警: 18人, 优势明显: 10人, 临界踩线: 6人, 临界踩线;全科预警: 2人**。</w:t>
+      </w:r>
+    </w:p>
+    <w:p>
+      <w:r>
+        <w:t>特别是 **全科预警** 的同学，建议立刻进行一对一谈话辅导。</w:t>
+      </w:r>
+    </w:p>
+    <w:p>
+      <w:r>
+        <w:drawing>
+          <wp:inline xmlns:a="http://schemas.openxmlformats.org/drawingml/2006/main" xmlns:pic="http://schemas.openxmlformats.org/drawingml/2006/picture">
+            <wp:extent cx="5486400" cy="2894400"/>
+            <wp:docPr id="7" name="Picture 7"/>
+            <wp:cNvGraphicFramePr>
+              <a:graphicFrameLocks noChangeAspect="1"/>
+            </wp:cNvGraphicFramePr>
+            <a:graphic>
+              <a:graphicData uri="http://schemas.openxmlformats.org/drawingml/2006/picture">
+                <pic:pic>
+                  <pic:nvPicPr>
+                    <pic:cNvPr id="0" name="top_bottom_bar.png"/>
+                    <pic:cNvPicPr/>
+                  </pic:nvPicPr>
+                  <pic:blipFill>
+                    <a:blip r:embed="rId15"/>
+                    <a:stretch>
+                      <a:fillRect/>
+                    </a:stretch>
+                  </pic:blipFill>
+                  <pic:spPr>
+                    <a:xfrm>
+                      <a:off x="0" y="0"/>
+                      <a:ext cx="5486400" cy="2894400"/>
+                    </a:xfrm>
+                    <a:prstGeom prst="rect"/>
+                  </pic:spPr>
+                </pic:pic>
+              </a:graphicData>
+            </a:graphic>
+          </wp:inline>
+        </w:drawing>
+      </w:r>
+    </w:p>
+    <w:p>
+      <w:r>
+        <w:t>---</w:t>
+      </w:r>
+    </w:p>
+    <w:p>
+      <w:pPr>
+        <w:pStyle w:val="Heading1"/>
+      </w:pPr>
+      <w:r>
+        <w:t>四、班级分层与尖子生画像</w:t>
+      </w:r>
+    </w:p>
+    <w:p>
+      <w:r>
+        <w:drawing>
+          <wp:inline xmlns:a="http://schemas.openxmlformats.org/drawingml/2006/main" xmlns:pic="http://schemas.openxmlformats.org/drawingml/2006/picture">
+            <wp:extent cx="5486400" cy="3112126"/>
+            <wp:docPr id="8" name="Picture 8"/>
+            <wp:cNvGraphicFramePr>
+              <a:graphicFrameLocks noChangeAspect="1"/>
+            </wp:cNvGraphicFramePr>
+            <a:graphic>
+              <a:graphicData uri="http://schemas.openxmlformats.org/drawingml/2006/picture">
+                <pic:pic>
+                  <pic:nvPicPr>
+                    <pic:cNvPr id="0" name="class_comparison.png"/>
+                    <pic:cNvPicPr/>
+                  </pic:nvPicPr>
+                  <pic:blipFill>
+                    <a:blip r:embed="rId16"/>
+                    <a:stretch>
+                      <a:fillRect/>
+                    </a:stretch>
+                  </pic:blipFill>
+                  <pic:spPr>
+                    <a:xfrm>
+                      <a:off x="0" y="0"/>
+                      <a:ext cx="5486400" cy="3112126"/>
+                    </a:xfrm>
+                    <a:prstGeom prst="rect"/>
+                  </pic:spPr>
+                </pic:pic>
+              </a:graphicData>
+            </a:graphic>
+          </wp:inline>
+        </w:drawing>
+      </w:r>
+    </w:p>
+    <w:p>
+      <w:r>
+        <w:drawing>
+          <wp:inline xmlns:a="http://schemas.openxmlformats.org/drawingml/2006/main" xmlns:pic="http://schemas.openxmlformats.org/drawingml/2006/picture">
+            <wp:extent cx="5486400" cy="4641763"/>
+            <wp:docPr id="9" name="Picture 9"/>
+            <wp:cNvGraphicFramePr>
+              <a:graphicFrameLocks noChangeAspect="1"/>
+            </wp:cNvGraphicFramePr>
+            <a:graphic>
+              <a:graphicData uri="http://schemas.openxmlformats.org/drawingml/2006/picture">
+                <pic:pic>
+                  <pic:nvPicPr>
+                    <pic:cNvPr id="0" name="radar_chart.png"/>
+                    <pic:cNvPicPr/>
+                  </pic:nvPicPr>
+                  <pic:blipFill>
+                    <a:blip r:embed="rId17"/>
+                    <a:stretch>
+                      <a:fillRect/>
+                    </a:stretch>
+                  </pic:blipFill>
+                  <pic:spPr>
+                    <a:xfrm>
+                      <a:off x="0" y="0"/>
+                      <a:ext cx="5486400" cy="4641763"/>
+                    </a:xfrm>
+                    <a:prstGeom prst="rect"/>
+                  </pic:spPr>
+                </pic:pic>
+              </a:graphicData>
+            </a:graphic>
+          </wp:inline>
+        </w:drawing>
+      </w:r>
+    </w:p>
+    <w:p>
+      <w:r>
+        <w:drawing>
+          <wp:inline xmlns:a="http://schemas.openxmlformats.org/drawingml/2006/main" xmlns:pic="http://schemas.openxmlformats.org/drawingml/2006/picture">
+            <wp:extent cx="5486400" cy="2454634"/>
+            <wp:docPr id="10" name="Picture 10"/>
+            <wp:cNvGraphicFramePr>
+              <a:graphicFrameLocks noChangeAspect="1"/>
+            </wp:cNvGraphicFramePr>
+            <a:graphic>
+              <a:graphicData uri="http://schemas.openxmlformats.org/drawingml/2006/picture">
+                <pic:pic>
+                  <pic:nvPicPr>
+                    <pic:cNvPr id="0" name="class_boxplot.png"/>
+                    <pic:cNvPicPr/>
+                  </pic:nvPicPr>
+                  <pic:blipFill>
+                    <a:blip r:embed="rId18"/>
+                    <a:stretch>
+                      <a:fillRect/>
+                    </a:stretch>
+                  </pic:blipFill>
+                  <pic:spPr>
+                    <a:xfrm>
+                      <a:off x="0" y="0"/>
+                      <a:ext cx="5486400" cy="2454634"/>
+                    </a:xfrm>
+                    <a:prstGeom prst="rect"/>
+                  </pic:spPr>
+                </pic:pic>
+              </a:graphicData>
+            </a:graphic>
+          </wp:inline>
+        </w:drawing>
+      </w:r>
+    </w:p>
+    <w:p>
+      <w:pPr>
+        <w:pStyle w:val="Heading1"/>
+      </w:pPr>
+      <w:r>
+        <w:t>🔎 尖子生 vs 后进生分水岭</w:t>
+      </w:r>
+    </w:p>
+    <w:p>
+      <w:r>
+        <w:t>通过对比前 20% 与后 20% 的学生平均分：</w:t>
+      </w:r>
+    </w:p>
+    <w:p>
+      <w:r>
+        <w:t>- **总分差距**：137.6 分</w:t>
+      </w:r>
+    </w:p>
+    <w:p>
+      <w:r>
+        <w:t>- **数学差距**：26.7 分（**最显著**）</w:t>
+      </w:r>
+    </w:p>
+    <w:p>
+      <w:r>
+        <w:t>- **英语差距**：34.3 分</w:t>
+      </w:r>
+    </w:p>
+    <w:p>
+      <w:r>
+        <w:t>- **语文差距**：12.3 分</w:t>
+      </w:r>
+    </w:p>
+    <w:p>
+      <w:r>
+        <w:t>**核心结论**：虽然专业综合的分差绝对值看起来最大（72.0分），但由于其满分高达 300 分且标准差大，实际上**数学**才是区分学生智商与逻辑思维的核心指标。后进生在数学上全面崩盘（平均分仅 86 对比尖子生的 115）。</w:t>
+      </w:r>
+    </w:p>
+    <w:p>
+      <w:r>
+        <w:t>---</w:t>
+      </w:r>
+    </w:p>
+    <w:p>
+      <w:pPr>
+        <w:pStyle w:val="Heading1"/>
+      </w:pPr>
+      <w:r>
+        <w:t>五、行动建议 (Action Plan)</w:t>
+      </w:r>
+    </w:p>
+    <w:p>
+      <w:pPr>
+        <w:pStyle w:val="Heading1"/>
+      </w:pPr>
+      <w:r>
+        <w:t>优先级一：数学培优补差</w:t>
+      </w:r>
+    </w:p>
+    <w:p>
+      <w:r>
+        <w:t>- **对象**：数学 &lt; 90 分的 5 名学生。</w:t>
+      </w:r>
+    </w:p>
+    <w:p>
+      <w:r>
+        <w:t>- **动作**：开展“基础计算限时训练”，确保基础公式题不丢分。</w:t>
+      </w:r>
+    </w:p>
+    <w:p>
+      <w:pPr>
+        <w:pStyle w:val="Heading1"/>
+      </w:pPr>
+      <w:r>
+        <w:t>优先级二：英语词汇突击</w:t>
+      </w:r>
+    </w:p>
+    <w:p>
+      <w:r>
+        <w:t>- **对象**：全体 31 人（尤其是 40-60 分段）。</w:t>
+      </w:r>
+    </w:p>
+    <w:p>
+      <w:r>
+        <w:t>- **动作**：每日晨读 30 分钟高频词汇；每周 2 篇完形填空打卡。</w:t>
+      </w:r>
+    </w:p>
+    <w:p>
+      <w:pPr>
+        <w:pStyle w:val="Heading1"/>
+      </w:pPr>
+      <w:r>
+        <w:t>优先级三：保持优势</w:t>
+      </w:r>
+    </w:p>
+    <w:p>
+      <w:r>
+        <w:t>- **对象**：语文 &amp; 专业综合。</w:t>
+      </w:r>
+    </w:p>
+    <w:p>
+      <w:r>
+        <w:t>- **动作**：保持当前节奏，鼓励优秀生进行更深层次的拓展阅读。</w:t>
       </w:r>
     </w:p>
     <w:sectPr>

</xml_diff>